<commit_message>
Redesign lab in reference style and align experiments with assignment
</commit_message>
<xml_diff>
--- a/report/Практическая_работа_2_Химический_выброс.docx
+++ b/report/Практическая_работа_2_Химический_выброс.docx
@@ -177,7 +177,7 @@
         </w:rPr>
         <w:fldChar w:fldCharType="separate"/>
       </w:r>
-      <w:hyperlink w:anchor="_Toc243310421" w:history="1">
+      <w:hyperlink w:anchor="_Toc243312924" w:history="1">
         <w:r>
           <w:rPr>
             <w:rStyle w:val="a5"/>
@@ -208,7 +208,7 @@
             <w:webHidden/>
             <w:sz w:val="24"/>
           </w:rPr>
-          <w:instrText xml:space="preserve"> PAGEREF _Toc243310421 \h </w:instrText>
+          <w:instrText xml:space="preserve"> PAGEREF _Toc243312924 \h </w:instrText>
         </w:r>
         <w:r>
           <w:rPr>
@@ -261,7 +261,7 @@
           <w14:ligatures w14:val="standardContextual"/>
         </w:rPr>
       </w:pPr>
-      <w:hyperlink w:anchor="_Toc243310422" w:history="1">
+      <w:hyperlink w:anchor="_Toc243312925" w:history="1">
         <w:r>
           <w:rPr>
             <w:rStyle w:val="a5"/>
@@ -292,7 +292,7 @@
             <w:webHidden/>
             <w:sz w:val="24"/>
           </w:rPr>
-          <w:instrText xml:space="preserve"> PAGEREF _Toc243310422 \h </w:instrText>
+          <w:instrText xml:space="preserve"> PAGEREF _Toc243312925 \h </w:instrText>
         </w:r>
         <w:r>
           <w:rPr>
@@ -345,7 +345,7 @@
           <w14:ligatures w14:val="standardContextual"/>
         </w:rPr>
       </w:pPr>
-      <w:hyperlink w:anchor="_Toc243310423" w:history="1">
+      <w:hyperlink w:anchor="_Toc243312926" w:history="1">
         <w:r>
           <w:rPr>
             <w:rStyle w:val="a5"/>
@@ -376,7 +376,7 @@
             <w:webHidden/>
             <w:sz w:val="24"/>
           </w:rPr>
-          <w:instrText xml:space="preserve"> PAGEREF _Toc243310423 \h </w:instrText>
+          <w:instrText xml:space="preserve"> PAGEREF _Toc243312926 \h </w:instrText>
         </w:r>
         <w:r>
           <w:rPr>
@@ -429,7 +429,7 @@
           <w14:ligatures w14:val="standardContextual"/>
         </w:rPr>
       </w:pPr>
-      <w:hyperlink w:anchor="_Toc243310424" w:history="1">
+      <w:hyperlink w:anchor="_Toc243312927" w:history="1">
         <w:r>
           <w:rPr>
             <w:rStyle w:val="a5"/>
@@ -460,7 +460,7 @@
             <w:webHidden/>
             <w:sz w:val="24"/>
           </w:rPr>
-          <w:instrText xml:space="preserve"> PAGEREF _Toc243310424 \h </w:instrText>
+          <w:instrText xml:space="preserve"> PAGEREF _Toc243312927 \h </w:instrText>
         </w:r>
         <w:r>
           <w:rPr>
@@ -513,7 +513,7 @@
           <w14:ligatures w14:val="standardContextual"/>
         </w:rPr>
       </w:pPr>
-      <w:hyperlink w:anchor="_Toc243310425" w:history="1">
+      <w:hyperlink w:anchor="_Toc243312928" w:history="1">
         <w:r>
           <w:rPr>
             <w:rStyle w:val="a5"/>
@@ -544,7 +544,7 @@
             <w:webHidden/>
             <w:sz w:val="24"/>
           </w:rPr>
-          <w:instrText xml:space="preserve"> PAGEREF _Toc243310425 \h </w:instrText>
+          <w:instrText xml:space="preserve"> PAGEREF _Toc243312928 \h </w:instrText>
         </w:r>
         <w:r>
           <w:rPr>
@@ -597,7 +597,7 @@
           <w14:ligatures w14:val="standardContextual"/>
         </w:rPr>
       </w:pPr>
-      <w:hyperlink w:anchor="_Toc243310426" w:history="1">
+      <w:hyperlink w:anchor="_Toc243312929" w:history="1">
         <w:r>
           <w:rPr>
             <w:rStyle w:val="a5"/>
@@ -628,7 +628,7 @@
             <w:webHidden/>
             <w:sz w:val="24"/>
           </w:rPr>
-          <w:instrText xml:space="preserve"> PAGEREF _Toc243310426 \h </w:instrText>
+          <w:instrText xml:space="preserve"> PAGEREF _Toc243312929 \h </w:instrText>
         </w:r>
         <w:r>
           <w:rPr>
@@ -681,7 +681,7 @@
           <w14:ligatures w14:val="standardContextual"/>
         </w:rPr>
       </w:pPr>
-      <w:hyperlink w:anchor="_Toc243310427" w:history="1">
+      <w:hyperlink w:anchor="_Toc243312930" w:history="1">
         <w:r>
           <w:rPr>
             <w:rStyle w:val="a5"/>
@@ -712,7 +712,7 @@
             <w:webHidden/>
             <w:sz w:val="24"/>
           </w:rPr>
-          <w:instrText xml:space="preserve"> PAGEREF _Toc243310427 \h </w:instrText>
+          <w:instrText xml:space="preserve"> PAGEREF _Toc243312930 \h </w:instrText>
         </w:r>
         <w:r>
           <w:rPr>
@@ -765,7 +765,7 @@
           <w14:ligatures w14:val="standardContextual"/>
         </w:rPr>
       </w:pPr>
-      <w:hyperlink w:anchor="_Toc243310428" w:history="1">
+      <w:hyperlink w:anchor="_Toc243312931" w:history="1">
         <w:r>
           <w:rPr>
             <w:rStyle w:val="a5"/>
@@ -796,7 +796,7 @@
             <w:webHidden/>
             <w:sz w:val="24"/>
           </w:rPr>
-          <w:instrText xml:space="preserve"> PAGEREF _Toc243310428 \h </w:instrText>
+          <w:instrText xml:space="preserve"> PAGEREF _Toc243312931 \h </w:instrText>
         </w:r>
         <w:r>
           <w:rPr>
@@ -849,7 +849,7 @@
           <w14:ligatures w14:val="standardContextual"/>
         </w:rPr>
       </w:pPr>
-      <w:hyperlink w:anchor="_Toc243310429" w:history="1">
+      <w:hyperlink w:anchor="_Toc243312932" w:history="1">
         <w:r>
           <w:rPr>
             <w:rStyle w:val="a5"/>
@@ -880,7 +880,7 @@
             <w:webHidden/>
             <w:sz w:val="24"/>
           </w:rPr>
-          <w:instrText xml:space="preserve"> PAGEREF _Toc243310429 \h </w:instrText>
+          <w:instrText xml:space="preserve"> PAGEREF _Toc243312932 \h </w:instrText>
         </w:r>
         <w:r>
           <w:rPr>
@@ -933,7 +933,7 @@
           <w14:ligatures w14:val="standardContextual"/>
         </w:rPr>
       </w:pPr>
-      <w:hyperlink w:anchor="_Toc243310430" w:history="1">
+      <w:hyperlink w:anchor="_Toc243312933" w:history="1">
         <w:r>
           <w:rPr>
             <w:rStyle w:val="a5"/>
@@ -964,7 +964,7 @@
             <w:webHidden/>
             <w:sz w:val="24"/>
           </w:rPr>
-          <w:instrText xml:space="preserve"> PAGEREF _Toc243310430 \h </w:instrText>
+          <w:instrText xml:space="preserve"> PAGEREF _Toc243312933 \h </w:instrText>
         </w:r>
         <w:r>
           <w:rPr>
@@ -1017,7 +1017,7 @@
           <w14:ligatures w14:val="standardContextual"/>
         </w:rPr>
       </w:pPr>
-      <w:hyperlink w:anchor="_Toc243310431" w:history="1">
+      <w:hyperlink w:anchor="_Toc243312934" w:history="1">
         <w:r>
           <w:rPr>
             <w:rStyle w:val="a5"/>
@@ -1048,7 +1048,7 @@
             <w:webHidden/>
             <w:sz w:val="24"/>
           </w:rPr>
-          <w:instrText xml:space="preserve"> PAGEREF _Toc243310431 \h </w:instrText>
+          <w:instrText xml:space="preserve"> PAGEREF _Toc243312934 \h </w:instrText>
         </w:r>
         <w:r>
           <w:rPr>
@@ -1101,7 +1101,7 @@
           <w14:ligatures w14:val="standardContextual"/>
         </w:rPr>
       </w:pPr>
-      <w:hyperlink w:anchor="_Toc243310432" w:history="1">
+      <w:hyperlink w:anchor="_Toc243312935" w:history="1">
         <w:r>
           <w:rPr>
             <w:rStyle w:val="a5"/>
@@ -1132,7 +1132,7 @@
             <w:webHidden/>
             <w:sz w:val="24"/>
           </w:rPr>
-          <w:instrText xml:space="preserve"> PAGEREF _Toc243310432 \h </w:instrText>
+          <w:instrText xml:space="preserve"> PAGEREF _Toc243312935 \h </w:instrText>
         </w:r>
         <w:r>
           <w:rPr>
@@ -1185,14 +1185,14 @@
           <w14:ligatures w14:val="standardContextual"/>
         </w:rPr>
       </w:pPr>
-      <w:hyperlink w:anchor="_Toc243310433" w:history="1">
+      <w:hyperlink w:anchor="_Toc243312936" w:history="1">
         <w:r>
           <w:rPr>
             <w:rStyle w:val="a5"/>
             <w:noProof/>
             <w:sz w:val="24"/>
           </w:rPr>
-          <w:t>3.5 Исследование соглашения о знаках</w:t>
+          <w:t>3.5 План вычислительного эксперимента</w:t>
         </w:r>
         <w:r>
           <w:rPr>
@@ -1216,7 +1216,7 @@
             <w:webHidden/>
             <w:sz w:val="24"/>
           </w:rPr>
-          <w:instrText xml:space="preserve"> PAGEREF _Toc243310433 \h </w:instrText>
+          <w:instrText xml:space="preserve"> PAGEREF _Toc243312936 \h </w:instrText>
         </w:r>
         <w:r>
           <w:rPr>
@@ -1269,7 +1269,7 @@
           <w14:ligatures w14:val="standardContextual"/>
         </w:rPr>
       </w:pPr>
-      <w:hyperlink w:anchor="_Toc243310434" w:history="1">
+      <w:hyperlink w:anchor="_Toc243312937" w:history="1">
         <w:r>
           <w:rPr>
             <w:rStyle w:val="a5"/>
@@ -1300,7 +1300,7 @@
             <w:webHidden/>
             <w:sz w:val="24"/>
           </w:rPr>
-          <w:instrText xml:space="preserve"> PAGEREF _Toc243310434 \h </w:instrText>
+          <w:instrText xml:space="preserve"> PAGEREF _Toc243312937 \h </w:instrText>
         </w:r>
         <w:r>
           <w:rPr>
@@ -1353,7 +1353,7 @@
           <w14:ligatures w14:val="standardContextual"/>
         </w:rPr>
       </w:pPr>
-      <w:hyperlink w:anchor="_Toc243310435" w:history="1">
+      <w:hyperlink w:anchor="_Toc243312938" w:history="1">
         <w:r>
           <w:rPr>
             <w:rStyle w:val="a5"/>
@@ -1384,7 +1384,7 @@
             <w:webHidden/>
             <w:sz w:val="24"/>
           </w:rPr>
-          <w:instrText xml:space="preserve"> PAGEREF _Toc243310435 \h </w:instrText>
+          <w:instrText xml:space="preserve"> PAGEREF _Toc243312938 \h </w:instrText>
         </w:r>
         <w:r>
           <w:rPr>
@@ -1437,7 +1437,7 @@
           <w14:ligatures w14:val="standardContextual"/>
         </w:rPr>
       </w:pPr>
-      <w:hyperlink w:anchor="_Toc243310436" w:history="1">
+      <w:hyperlink w:anchor="_Toc243312939" w:history="1">
         <w:r>
           <w:rPr>
             <w:rStyle w:val="a5"/>
@@ -1468,7 +1468,7 @@
             <w:webHidden/>
             <w:sz w:val="24"/>
           </w:rPr>
-          <w:instrText xml:space="preserve"> PAGEREF _Toc243310436 \h </w:instrText>
+          <w:instrText xml:space="preserve"> PAGEREF _Toc243312939 \h </w:instrText>
         </w:r>
         <w:r>
           <w:rPr>
@@ -1521,7 +1521,7 @@
           <w14:ligatures w14:val="standardContextual"/>
         </w:rPr>
       </w:pPr>
-      <w:hyperlink w:anchor="_Toc243310437" w:history="1">
+      <w:hyperlink w:anchor="_Toc243312940" w:history="1">
         <w:r>
           <w:rPr>
             <w:rStyle w:val="a5"/>
@@ -1552,7 +1552,7 @@
             <w:webHidden/>
             <w:sz w:val="24"/>
           </w:rPr>
-          <w:instrText xml:space="preserve"> PAGEREF _Toc243310437 \h </w:instrText>
+          <w:instrText xml:space="preserve"> PAGEREF _Toc243312940 \h </w:instrText>
         </w:r>
         <w:r>
           <w:rPr>
@@ -1605,7 +1605,7 @@
           <w14:ligatures w14:val="standardContextual"/>
         </w:rPr>
       </w:pPr>
-      <w:hyperlink w:anchor="_Toc243310438" w:history="1">
+      <w:hyperlink w:anchor="_Toc243312941" w:history="1">
         <w:r>
           <w:rPr>
             <w:rStyle w:val="a5"/>
@@ -1636,7 +1636,7 @@
             <w:webHidden/>
             <w:sz w:val="24"/>
           </w:rPr>
-          <w:instrText xml:space="preserve"> PAGEREF _Toc243310438 \h </w:instrText>
+          <w:instrText xml:space="preserve"> PAGEREF _Toc243312941 \h </w:instrText>
         </w:r>
         <w:r>
           <w:rPr>
@@ -1689,7 +1689,7 @@
           <w14:ligatures w14:val="standardContextual"/>
         </w:rPr>
       </w:pPr>
-      <w:hyperlink w:anchor="_Toc243310439" w:history="1">
+      <w:hyperlink w:anchor="_Toc243312942" w:history="1">
         <w:r>
           <w:rPr>
             <w:rStyle w:val="a5"/>
@@ -1720,7 +1720,7 @@
             <w:webHidden/>
             <w:sz w:val="24"/>
           </w:rPr>
-          <w:instrText xml:space="preserve"> PAGEREF _Toc243310439 \h </w:instrText>
+          <w:instrText xml:space="preserve"> PAGEREF _Toc243312942 \h </w:instrText>
         </w:r>
         <w:r>
           <w:rPr>
@@ -1773,7 +1773,7 @@
           <w14:ligatures w14:val="standardContextual"/>
         </w:rPr>
       </w:pPr>
-      <w:hyperlink w:anchor="_Toc243310440" w:history="1">
+      <w:hyperlink w:anchor="_Toc243312943" w:history="1">
         <w:r>
           <w:rPr>
             <w:rStyle w:val="a5"/>
@@ -1804,7 +1804,7 @@
             <w:webHidden/>
             <w:sz w:val="24"/>
           </w:rPr>
-          <w:instrText xml:space="preserve"> PAGEREF _Toc243310440 \h </w:instrText>
+          <w:instrText xml:space="preserve"> PAGEREF _Toc243312943 \h </w:instrText>
         </w:r>
         <w:r>
           <w:rPr>
@@ -1857,7 +1857,7 @@
           <w14:ligatures w14:val="standardContextual"/>
         </w:rPr>
       </w:pPr>
-      <w:hyperlink w:anchor="_Toc243310441" w:history="1">
+      <w:hyperlink w:anchor="_Toc243312944" w:history="1">
         <w:r>
           <w:rPr>
             <w:rStyle w:val="a5"/>
@@ -1888,7 +1888,7 @@
             <w:webHidden/>
             <w:sz w:val="24"/>
           </w:rPr>
-          <w:instrText xml:space="preserve"> PAGEREF _Toc243310441 \h </w:instrText>
+          <w:instrText xml:space="preserve"> PAGEREF _Toc243312944 \h </w:instrText>
         </w:r>
         <w:r>
           <w:rPr>
@@ -1941,7 +1941,7 @@
           <w14:ligatures w14:val="standardContextual"/>
         </w:rPr>
       </w:pPr>
-      <w:hyperlink w:anchor="_Toc243310442" w:history="1">
+      <w:hyperlink w:anchor="_Toc243312945" w:history="1">
         <w:r>
           <w:rPr>
             <w:rStyle w:val="a5"/>
@@ -1972,7 +1972,7 @@
             <w:webHidden/>
             <w:sz w:val="24"/>
           </w:rPr>
-          <w:instrText xml:space="preserve"> PAGEREF _Toc243310442 \h </w:instrText>
+          <w:instrText xml:space="preserve"> PAGEREF _Toc243312945 \h </w:instrText>
         </w:r>
         <w:r>
           <w:rPr>
@@ -2025,7 +2025,7 @@
           <w14:ligatures w14:val="standardContextual"/>
         </w:rPr>
       </w:pPr>
-      <w:hyperlink w:anchor="_Toc243310443" w:history="1">
+      <w:hyperlink w:anchor="_Toc243312946" w:history="1">
         <w:r>
           <w:rPr>
             <w:rStyle w:val="a5"/>
@@ -2056,7 +2056,7 @@
             <w:webHidden/>
             <w:sz w:val="24"/>
           </w:rPr>
-          <w:instrText xml:space="preserve"> PAGEREF _Toc243310443 \h </w:instrText>
+          <w:instrText xml:space="preserve"> PAGEREF _Toc243312946 \h </w:instrText>
         </w:r>
         <w:r>
           <w:rPr>
@@ -2109,7 +2109,7 @@
           <w14:ligatures w14:val="standardContextual"/>
         </w:rPr>
       </w:pPr>
-      <w:hyperlink w:anchor="_Toc243310444" w:history="1">
+      <w:hyperlink w:anchor="_Toc243312947" w:history="1">
         <w:r>
           <w:rPr>
             <w:rStyle w:val="a5"/>
@@ -2140,7 +2140,7 @@
             <w:webHidden/>
             <w:sz w:val="24"/>
           </w:rPr>
-          <w:instrText xml:space="preserve"> PAGEREF _Toc243310444 \h </w:instrText>
+          <w:instrText xml:space="preserve"> PAGEREF _Toc243312947 \h </w:instrText>
         </w:r>
         <w:r>
           <w:rPr>
@@ -2193,7 +2193,7 @@
           <w14:ligatures w14:val="standardContextual"/>
         </w:rPr>
       </w:pPr>
-      <w:hyperlink w:anchor="_Toc243310445" w:history="1">
+      <w:hyperlink w:anchor="_Toc243312948" w:history="1">
         <w:r>
           <w:rPr>
             <w:rStyle w:val="a5"/>
@@ -2224,7 +2224,7 @@
             <w:webHidden/>
             <w:sz w:val="24"/>
           </w:rPr>
-          <w:instrText xml:space="preserve"> PAGEREF _Toc243310445 \h </w:instrText>
+          <w:instrText xml:space="preserve"> PAGEREF _Toc243312948 \h </w:instrText>
         </w:r>
         <w:r>
           <w:rPr>
@@ -2277,7 +2277,7 @@
           <w14:ligatures w14:val="standardContextual"/>
         </w:rPr>
       </w:pPr>
-      <w:hyperlink w:anchor="_Toc243310446" w:history="1">
+      <w:hyperlink w:anchor="_Toc243312949" w:history="1">
         <w:r>
           <w:rPr>
             <w:rStyle w:val="a5"/>
@@ -2308,7 +2308,7 @@
             <w:webHidden/>
             <w:sz w:val="24"/>
           </w:rPr>
-          <w:instrText xml:space="preserve"> PAGEREF _Toc243310446 \h </w:instrText>
+          <w:instrText xml:space="preserve"> PAGEREF _Toc243312949 \h </w:instrText>
         </w:r>
         <w:r>
           <w:rPr>
@@ -2361,7 +2361,7 @@
           <w14:ligatures w14:val="standardContextual"/>
         </w:rPr>
       </w:pPr>
-      <w:hyperlink w:anchor="_Toc243310447" w:history="1">
+      <w:hyperlink w:anchor="_Toc243312950" w:history="1">
         <w:r>
           <w:rPr>
             <w:rStyle w:val="a5"/>
@@ -2392,7 +2392,7 @@
             <w:webHidden/>
             <w:sz w:val="24"/>
           </w:rPr>
-          <w:instrText xml:space="preserve"> PAGEREF _Toc243310447 \h </w:instrText>
+          <w:instrText xml:space="preserve"> PAGEREF _Toc243312950 \h </w:instrText>
         </w:r>
         <w:r>
           <w:rPr>
@@ -2445,7 +2445,7 @@
           <w14:ligatures w14:val="standardContextual"/>
         </w:rPr>
       </w:pPr>
-      <w:hyperlink w:anchor="_Toc243310448" w:history="1">
+      <w:hyperlink w:anchor="_Toc243312951" w:history="1">
         <w:r>
           <w:rPr>
             <w:rStyle w:val="a5"/>
@@ -2476,7 +2476,7 @@
             <w:webHidden/>
             <w:sz w:val="24"/>
           </w:rPr>
-          <w:instrText xml:space="preserve"> PAGEREF _Toc243310448 \h </w:instrText>
+          <w:instrText xml:space="preserve"> PAGEREF _Toc243312951 \h </w:instrText>
         </w:r>
         <w:r>
           <w:rPr>
@@ -2499,7 +2499,7 @@
             <w:webHidden/>
             <w:sz w:val="24"/>
           </w:rPr>
-          <w:t>17</w:t>
+          <w:t>18</w:t>
         </w:r>
         <w:r>
           <w:rPr>
@@ -2529,7 +2529,7 @@
           <w14:ligatures w14:val="standardContextual"/>
         </w:rPr>
       </w:pPr>
-      <w:hyperlink w:anchor="_Toc243310449" w:history="1">
+      <w:hyperlink w:anchor="_Toc243312952" w:history="1">
         <w:r>
           <w:rPr>
             <w:rStyle w:val="a5"/>
@@ -2560,7 +2560,7 @@
             <w:webHidden/>
             <w:sz w:val="24"/>
           </w:rPr>
-          <w:instrText xml:space="preserve"> PAGEREF _Toc243310449 \h </w:instrText>
+          <w:instrText xml:space="preserve"> PAGEREF _Toc243312952 \h </w:instrText>
         </w:r>
         <w:r>
           <w:rPr>
@@ -2583,7 +2583,7 @@
             <w:webHidden/>
             <w:sz w:val="24"/>
           </w:rPr>
-          <w:t>18</w:t>
+          <w:t>19</w:t>
         </w:r>
         <w:r>
           <w:rPr>
@@ -2613,7 +2613,7 @@
           <w14:ligatures w14:val="standardContextual"/>
         </w:rPr>
       </w:pPr>
-      <w:hyperlink w:anchor="_Toc243310450" w:history="1">
+      <w:hyperlink w:anchor="_Toc243312953" w:history="1">
         <w:r>
           <w:rPr>
             <w:rStyle w:val="a5"/>
@@ -2644,7 +2644,7 @@
             <w:webHidden/>
             <w:sz w:val="24"/>
           </w:rPr>
-          <w:instrText xml:space="preserve"> PAGEREF _Toc243310450 \h </w:instrText>
+          <w:instrText xml:space="preserve"> PAGEREF _Toc243312953 \h </w:instrText>
         </w:r>
         <w:r>
           <w:rPr>
@@ -2667,7 +2667,7 @@
             <w:webHidden/>
             <w:sz w:val="24"/>
           </w:rPr>
-          <w:t>19</w:t>
+          <w:t>20</w:t>
         </w:r>
         <w:r>
           <w:rPr>
@@ -2697,7 +2697,7 @@
           <w14:ligatures w14:val="standardContextual"/>
         </w:rPr>
       </w:pPr>
-      <w:hyperlink w:anchor="_Toc243310451" w:history="1">
+      <w:hyperlink w:anchor="_Toc243312954" w:history="1">
         <w:r>
           <w:rPr>
             <w:rStyle w:val="a5"/>
@@ -2728,7 +2728,7 @@
             <w:webHidden/>
             <w:sz w:val="24"/>
           </w:rPr>
-          <w:instrText xml:space="preserve"> PAGEREF _Toc243310451 \h </w:instrText>
+          <w:instrText xml:space="preserve"> PAGEREF _Toc243312954 \h </w:instrText>
         </w:r>
         <w:r>
           <w:rPr>
@@ -2751,7 +2751,7 @@
             <w:webHidden/>
             <w:sz w:val="24"/>
           </w:rPr>
-          <w:t>19</w:t>
+          <w:t>20</w:t>
         </w:r>
         <w:r>
           <w:rPr>
@@ -2781,7 +2781,7 @@
           <w14:ligatures w14:val="standardContextual"/>
         </w:rPr>
       </w:pPr>
-      <w:hyperlink w:anchor="_Toc243310452" w:history="1">
+      <w:hyperlink w:anchor="_Toc243312955" w:history="1">
         <w:r>
           <w:rPr>
             <w:rStyle w:val="a5"/>
@@ -2812,7 +2812,7 @@
             <w:webHidden/>
             <w:sz w:val="24"/>
           </w:rPr>
-          <w:instrText xml:space="preserve"> PAGEREF _Toc243310452 \h </w:instrText>
+          <w:instrText xml:space="preserve"> PAGEREF _Toc243312955 \h </w:instrText>
         </w:r>
         <w:r>
           <w:rPr>
@@ -2835,7 +2835,7 @@
             <w:webHidden/>
             <w:sz w:val="24"/>
           </w:rPr>
-          <w:t>20</w:t>
+          <w:t>21</w:t>
         </w:r>
         <w:r>
           <w:rPr>
@@ -2865,7 +2865,7 @@
           <w14:ligatures w14:val="standardContextual"/>
         </w:rPr>
       </w:pPr>
-      <w:hyperlink w:anchor="_Toc243310453" w:history="1">
+      <w:hyperlink w:anchor="_Toc243312956" w:history="1">
         <w:r>
           <w:rPr>
             <w:rStyle w:val="a5"/>
@@ -2896,7 +2896,7 @@
             <w:webHidden/>
             <w:sz w:val="24"/>
           </w:rPr>
-          <w:instrText xml:space="preserve"> PAGEREF _Toc243310453 \h </w:instrText>
+          <w:instrText xml:space="preserve"> PAGEREF _Toc243312956 \h </w:instrText>
         </w:r>
         <w:r>
           <w:rPr>
@@ -2919,7 +2919,7 @@
             <w:webHidden/>
             <w:sz w:val="24"/>
           </w:rPr>
-          <w:t>21</w:t>
+          <w:t>22</w:t>
         </w:r>
         <w:r>
           <w:rPr>
@@ -2949,7 +2949,7 @@
           <w14:ligatures w14:val="standardContextual"/>
         </w:rPr>
       </w:pPr>
-      <w:hyperlink w:anchor="_Toc243310454" w:history="1">
+      <w:hyperlink w:anchor="_Toc243312957" w:history="1">
         <w:r>
           <w:rPr>
             <w:rStyle w:val="a5"/>
@@ -2980,7 +2980,7 @@
             <w:webHidden/>
             <w:sz w:val="24"/>
           </w:rPr>
-          <w:instrText xml:space="preserve"> PAGEREF _Toc243310454 \h </w:instrText>
+          <w:instrText xml:space="preserve"> PAGEREF _Toc243312957 \h </w:instrText>
         </w:r>
         <w:r>
           <w:rPr>
@@ -3003,7 +3003,7 @@
             <w:webHidden/>
             <w:sz w:val="24"/>
           </w:rPr>
-          <w:t>24</w:t>
+          <w:t>25</w:t>
         </w:r>
         <w:r>
           <w:rPr>
@@ -3033,7 +3033,7 @@
           <w14:ligatures w14:val="standardContextual"/>
         </w:rPr>
       </w:pPr>
-      <w:hyperlink w:anchor="_Toc243310455" w:history="1">
+      <w:hyperlink w:anchor="_Toc243312958" w:history="1">
         <w:r>
           <w:rPr>
             <w:rStyle w:val="a5"/>
@@ -3064,7 +3064,7 @@
             <w:webHidden/>
             <w:sz w:val="24"/>
           </w:rPr>
-          <w:instrText xml:space="preserve"> PAGEREF _Toc243310455 \h </w:instrText>
+          <w:instrText xml:space="preserve"> PAGEREF _Toc243312958 \h </w:instrText>
         </w:r>
         <w:r>
           <w:rPr>
@@ -3087,7 +3087,7 @@
             <w:webHidden/>
             <w:sz w:val="24"/>
           </w:rPr>
-          <w:t>25</w:t>
+          <w:t>26</w:t>
         </w:r>
         <w:r>
           <w:rPr>
@@ -3117,14 +3117,14 @@
           <w14:ligatures w14:val="standardContextual"/>
         </w:rPr>
       </w:pPr>
-      <w:hyperlink w:anchor="_Toc243310456" w:history="1">
+      <w:hyperlink w:anchor="_Toc243312959" w:history="1">
         <w:r>
           <w:rPr>
             <w:rStyle w:val="a5"/>
             <w:noProof/>
             <w:sz w:val="24"/>
           </w:rPr>
-          <w:t>7.6 Чувствительность к соглашению о знаках</w:t>
+          <w:t>7.6 Влияние объёма выброса</w:t>
         </w:r>
         <w:r>
           <w:rPr>
@@ -3148,7 +3148,7 @@
             <w:webHidden/>
             <w:sz w:val="24"/>
           </w:rPr>
-          <w:instrText xml:space="preserve"> PAGEREF _Toc243310456 \h </w:instrText>
+          <w:instrText xml:space="preserve"> PAGEREF _Toc243312959 \h </w:instrText>
         </w:r>
         <w:r>
           <w:rPr>
@@ -3171,7 +3171,7 @@
             <w:webHidden/>
             <w:sz w:val="24"/>
           </w:rPr>
-          <w:t>28</w:t>
+          <w:t>29</w:t>
         </w:r>
         <w:r>
           <w:rPr>
@@ -3201,7 +3201,7 @@
           <w14:ligatures w14:val="standardContextual"/>
         </w:rPr>
       </w:pPr>
-      <w:hyperlink w:anchor="_Toc243310457" w:history="1">
+      <w:hyperlink w:anchor="_Toc243312960" w:history="1">
         <w:r>
           <w:rPr>
             <w:rStyle w:val="a5"/>
@@ -3232,7 +3232,7 @@
             <w:webHidden/>
             <w:sz w:val="24"/>
           </w:rPr>
-          <w:instrText xml:space="preserve"> PAGEREF _Toc243310457 \h </w:instrText>
+          <w:instrText xml:space="preserve"> PAGEREF _Toc243312960 \h </w:instrText>
         </w:r>
         <w:r>
           <w:rPr>
@@ -3255,7 +3255,7 @@
             <w:webHidden/>
             <w:sz w:val="24"/>
           </w:rPr>
-          <w:t>29</w:t>
+          <w:t>30</w:t>
         </w:r>
         <w:r>
           <w:rPr>
@@ -3285,7 +3285,7 @@
           <w14:ligatures w14:val="standardContextual"/>
         </w:rPr>
       </w:pPr>
-      <w:hyperlink w:anchor="_Toc243310458" w:history="1">
+      <w:hyperlink w:anchor="_Toc243312961" w:history="1">
         <w:r>
           <w:rPr>
             <w:rStyle w:val="a5"/>
@@ -3316,7 +3316,7 @@
             <w:webHidden/>
             <w:sz w:val="24"/>
           </w:rPr>
-          <w:instrText xml:space="preserve"> PAGEREF _Toc243310458 \h </w:instrText>
+          <w:instrText xml:space="preserve"> PAGEREF _Toc243312961 \h </w:instrText>
         </w:r>
         <w:r>
           <w:rPr>
@@ -3339,7 +3339,7 @@
             <w:webHidden/>
             <w:sz w:val="24"/>
           </w:rPr>
-          <w:t>29</w:t>
+          <w:t>30</w:t>
         </w:r>
         <w:r>
           <w:rPr>
@@ -3369,7 +3369,7 @@
           <w14:ligatures w14:val="standardContextual"/>
         </w:rPr>
       </w:pPr>
-      <w:hyperlink w:anchor="_Toc243310459" w:history="1">
+      <w:hyperlink w:anchor="_Toc243312962" w:history="1">
         <w:r>
           <w:rPr>
             <w:rStyle w:val="a5"/>
@@ -3400,7 +3400,7 @@
             <w:webHidden/>
             <w:sz w:val="24"/>
           </w:rPr>
-          <w:instrText xml:space="preserve"> PAGEREF _Toc243310459 \h </w:instrText>
+          <w:instrText xml:space="preserve"> PAGEREF _Toc243312962 \h </w:instrText>
         </w:r>
         <w:r>
           <w:rPr>
@@ -3423,7 +3423,7 @@
             <w:webHidden/>
             <w:sz w:val="24"/>
           </w:rPr>
-          <w:t>29</w:t>
+          <w:t>30</w:t>
         </w:r>
         <w:r>
           <w:rPr>
@@ -3453,7 +3453,7 @@
           <w14:ligatures w14:val="standardContextual"/>
         </w:rPr>
       </w:pPr>
-      <w:hyperlink w:anchor="_Toc243310460" w:history="1">
+      <w:hyperlink w:anchor="_Toc243312963" w:history="1">
         <w:r>
           <w:rPr>
             <w:rStyle w:val="a5"/>
@@ -3484,7 +3484,7 @@
             <w:webHidden/>
             <w:sz w:val="24"/>
           </w:rPr>
-          <w:instrText xml:space="preserve"> PAGEREF _Toc243310460 \h </w:instrText>
+          <w:instrText xml:space="preserve"> PAGEREF _Toc243312963 \h </w:instrText>
         </w:r>
         <w:r>
           <w:rPr>
@@ -3507,7 +3507,7 @@
             <w:webHidden/>
             <w:sz w:val="24"/>
           </w:rPr>
-          <w:t>30</w:t>
+          <w:t>31</w:t>
         </w:r>
         <w:r>
           <w:rPr>
@@ -3537,7 +3537,7 @@
           <w14:ligatures w14:val="standardContextual"/>
         </w:rPr>
       </w:pPr>
-      <w:hyperlink w:anchor="_Toc243310461" w:history="1">
+      <w:hyperlink w:anchor="_Toc243312964" w:history="1">
         <w:r>
           <w:rPr>
             <w:rStyle w:val="a5"/>
@@ -3568,7 +3568,7 @@
             <w:webHidden/>
             <w:sz w:val="24"/>
           </w:rPr>
-          <w:instrText xml:space="preserve"> PAGEREF _Toc243310461 \h </w:instrText>
+          <w:instrText xml:space="preserve"> PAGEREF _Toc243312964 \h </w:instrText>
         </w:r>
         <w:r>
           <w:rPr>
@@ -3591,7 +3591,7 @@
             <w:webHidden/>
             <w:sz w:val="24"/>
           </w:rPr>
-          <w:t>30</w:t>
+          <w:t>31</w:t>
         </w:r>
         <w:r>
           <w:rPr>
@@ -3624,7 +3624,7 @@
       <w:pPr>
         <w:pStyle w:val="1"/>
       </w:pPr>
-      <w:bookmarkStart w:id="0" w:name="_Toc243310421"/>
+      <w:bookmarkStart w:id="0" w:name="_Toc243312924"/>
       <w:r>
         <w:t>1 Постановка задачи</w:t>
       </w:r>
@@ -3649,7 +3649,7 @@
       <w:pPr>
         <w:pStyle w:val="2"/>
       </w:pPr>
-      <w:bookmarkStart w:id="1" w:name="_Toc243310422"/>
+      <w:bookmarkStart w:id="1" w:name="_Toc243312925"/>
       <w:r>
         <w:t>1.1 Требования к программе</w:t>
       </w:r>
@@ -4153,7 +4153,7 @@
               <w:rPr>
                 <w:sz w:val="24"/>
               </w:rPr>
-              <w:t>Базовый сценарий, изменение ветра, задержки и знаков</w:t>
+              <w:t>Базовый сценарий, изменение ветра, задержки и объёма</w:t>
             </w:r>
           </w:p>
         </w:tc>
@@ -4224,7 +4224,7 @@
       <w:pPr>
         <w:pStyle w:val="2"/>
       </w:pPr>
-      <w:bookmarkStart w:id="2" w:name="_Toc243310423"/>
+      <w:bookmarkStart w:id="2" w:name="_Toc243312926"/>
       <w:r>
         <w:t>1.2 Состав результата</w:t>
       </w:r>
@@ -4244,7 +4244,7 @@
       <w:pPr>
         <w:pStyle w:val="1"/>
       </w:pPr>
-      <w:bookmarkStart w:id="3" w:name="_Toc243310424"/>
+      <w:bookmarkStart w:id="3" w:name="_Toc243312927"/>
       <w:r>
         <w:t>2 Предметная область</w:t>
       </w:r>
@@ -4254,7 +4254,7 @@
       <w:pPr>
         <w:pStyle w:val="2"/>
       </w:pPr>
-      <w:bookmarkStart w:id="4" w:name="_Toc243310425"/>
+      <w:bookmarkStart w:id="4" w:name="_Toc243312928"/>
       <w:r>
         <w:t>2.1 Агрегированные последствия химической аварии</w:t>
       </w:r>
@@ -4274,7 +4274,7 @@
       <w:pPr>
         <w:pStyle w:val="2"/>
       </w:pPr>
-      <w:bookmarkStart w:id="5" w:name="_Toc243310426"/>
+      <w:bookmarkStart w:id="5" w:name="_Toc243312929"/>
       <w:r>
         <w:t>2.2 Характеристики и внешние факторы</w:t>
       </w:r>
@@ -6371,7 +6371,7 @@
       <w:pPr>
         <w:pStyle w:val="2"/>
       </w:pPr>
-      <w:bookmarkStart w:id="6" w:name="_Toc243310427"/>
+      <w:bookmarkStart w:id="6" w:name="_Toc243312930"/>
       <w:r>
         <w:t>2.3 Отличие от расчёта опасной зоны</w:t>
       </w:r>
@@ -6391,7 +6391,7 @@
       <w:pPr>
         <w:pStyle w:val="1"/>
       </w:pPr>
-      <w:bookmarkStart w:id="7" w:name="_Toc243310428"/>
+      <w:bookmarkStart w:id="7" w:name="_Toc243312931"/>
       <w:r>
         <w:t>3 Математическая модель</w:t>
       </w:r>
@@ -6401,7 +6401,7 @@
       <w:pPr>
         <w:pStyle w:val="2"/>
       </w:pPr>
-      <w:bookmarkStart w:id="8" w:name="_Toc243310429"/>
+      <w:bookmarkStart w:id="8" w:name="_Toc243312932"/>
       <w:r>
         <w:t>3.1 Согласование записи исходного задания</w:t>
       </w:r>
@@ -6419,14 +6419,14 @@
     </w:p>
     <w:p>
       <w:r>
-        <w:t>В исходной таблице f₂⁻, f₄⁻, f₆⁻, f₈⁻ и f₁₁⁻ имеют отрицательные коэффициенты; отрицательна также f₃⁺. Это не согласуется с трактовкой всех f⁺ как положительных притоков, а f⁻ как положительных оттоков. Буквальный режим сохраняет числа и знаки, но называет f⁺ и f⁻ алгебраическими частями правой стороны. Проверка отдельного режима модулей позволяет показать влияние иной трактовки, не подменяя исходный расчёт.</w:t>
+        <w:t>В исходной таблице f₂⁻, f₄⁻, f₆⁻, f₈⁻ и f₁₁⁻ имеют отрицательные коэффициенты; отрицательна также f₃⁺. Это не согласуется с трактовкой всех f⁺ как положительных притоков, а f⁻ как положительных оттоков. В реализации сохранены исходные числа и знаки. Поэтому f⁺ и f⁻ рассматриваются как алгебраические части правой стороны. Приложение исполняет одну систему уравнений; отдельного переключателя их трактовки нет.</w:t>
       </w:r>
     </w:p>
     <w:p>
       <w:pPr>
         <w:pStyle w:val="2"/>
       </w:pPr>
-      <w:bookmarkStart w:id="9" w:name="_Toc243310430"/>
+      <w:bookmarkStart w:id="9" w:name="_Toc243312933"/>
       <w:r>
         <w:t>3.2 Общая форма и начальные условия</w:t>
       </w:r>
@@ -6848,7 +6848,7 @@
       <w:pPr>
         <w:pStyle w:val="2"/>
       </w:pPr>
-      <w:bookmarkStart w:id="10" w:name="_Toc243310431"/>
+      <w:bookmarkStart w:id="10" w:name="_Toc243312934"/>
       <w:r>
         <w:t>3.3 Полная табличная система</w:t>
       </w:r>
@@ -6856,7 +6856,7 @@
     </w:p>
     <w:p>
       <w:r>
-        <w:t>Ниже приведены все одиннадцать уравнений базового буквального режима. Члены сформированы из тех же выражений PLUS и MINUS, которые используются вычислительным ядром. Скобки вокруг вычитаемой отрицательной функции сохранены, чтобы соглашение о знаках было видно непосредственно в формуле.</w:t>
+        <w:t>Ниже приведены все одиннадцать уравнений табличной модели. Члены сформированы из тех же выражений PLUS и MINUS, которые используются вычислительным ядром. Скобки вокруг вычитаемой отрицательной функции сохранены, чтобы соглашение о знаках было видно непосредственно в формуле.</w:t>
       </w:r>
     </w:p>
     <w:tbl>
@@ -10490,7 +10490,7 @@
       <w:pPr>
         <w:pStyle w:val="2"/>
       </w:pPr>
-      <w:bookmarkStart w:id="11" w:name="_Toc243310432"/>
+      <w:bookmarkStart w:id="11" w:name="_Toc243312935"/>
       <w:r>
         <w:t>3.4 Область определения и допустимость решений</w:t>
       </w:r>
@@ -10515,15 +10515,20 @@
       <w:pPr>
         <w:pStyle w:val="2"/>
       </w:pPr>
-      <w:bookmarkStart w:id="12" w:name="_Toc243310433"/>
-      <w:r>
-        <w:t>3.5 Исследование соглашения о знаках</w:t>
+      <w:bookmarkStart w:id="12" w:name="_Toc243312936"/>
+      <w:r>
+        <w:t>3.5 План вычислительного эксперимента</w:t>
       </w:r>
       <w:bookmarkEnd w:id="12"/>
     </w:p>
     <w:p>
       <w:r>
-        <w:t>Во втором режиме меняется только операция обработки fᵢ⁻. Все исходные выражения остаются прежними:</w:t>
+        <w:t>Для всех четырёх сценариев используются одни и те же уравнения, начальные условия, делители и допуски решателя. В каждом возмущённом сценарии меняется только один внешний фактор: профиль ветра F₃, задержка оповещения F₅ либо объём выброса F₁. Такой план отделяет влияние выбранного входа от изменения самой модели.</w:t>
+      </w:r>
+    </w:p>
+    <w:p>
+      <w:r>
+        <w:t>Для положительного базового конечного значения относительное изменение показателя определяется следующим образом:</w:t>
       </w:r>
     </w:p>
     <w:tbl>
@@ -10580,66 +10585,39 @@
             </w:pPr>
             <m:oMathPara>
               <m:oMath>
-                <m:f>
-                  <m:fPr>
+                <m:sSub>
+                  <m:sSubPr>
                     <m:ctrlPr>
                       <w:rPr>
                         <w:rFonts w:ascii="Cambria Math" w:hAnsi="Cambria Math"/>
                       </w:rPr>
                     </m:ctrlPr>
-                  </m:fPr>
-                  <m:num>
+                  </m:sSubPr>
+                  <m:e>
                     <m:r>
                       <w:rPr>
                         <w:rFonts w:ascii="Cambria Math" w:hAnsi="Cambria Math"/>
                         <w:sz w:val="26"/>
                       </w:rPr>
-                      <m:t>d</m:t>
+                      <m:t>Δ</m:t>
                     </m:r>
-                    <m:sSub>
-                      <m:sSubPr>
-                        <m:ctrlPr>
-                          <w:rPr>
-                            <w:rFonts w:ascii="Cambria Math" w:hAnsi="Cambria Math"/>
-                          </w:rPr>
-                        </m:ctrlPr>
-                      </m:sSubPr>
-                      <m:e>
-                        <m:r>
-                          <w:rPr>
-                            <w:rFonts w:ascii="Cambria Math" w:hAnsi="Cambria Math"/>
-                            <w:sz w:val="26"/>
-                          </w:rPr>
-                          <m:t>X</m:t>
-                        </m:r>
-                      </m:e>
-                      <m:sub>
-                        <m:r>
-                          <w:rPr>
-                            <w:rFonts w:ascii="Cambria Math" w:hAnsi="Cambria Math"/>
-                            <w:sz w:val="26"/>
-                          </w:rPr>
-                          <m:t>i</m:t>
-                        </m:r>
-                      </m:sub>
-                    </m:sSub>
-                  </m:num>
-                  <m:den>
+                  </m:e>
+                  <m:sub>
                     <m:r>
                       <w:rPr>
                         <w:rFonts w:ascii="Cambria Math" w:hAnsi="Cambria Math"/>
                         <w:sz w:val="26"/>
                       </w:rPr>
-                      <m:t>dτ</m:t>
+                      <m:t>i</m:t>
                     </m:r>
-                  </m:den>
-                </m:f>
+                  </m:sub>
+                </m:sSub>
                 <m:r>
                   <w:rPr>
                     <w:rFonts w:ascii="Cambria Math" w:hAnsi="Cambria Math"/>
                     <w:sz w:val="26"/>
                   </w:rPr>
-                  <m:t>=</m:t>
+                  <m:t xml:space="preserve"> = 100% · </m:t>
                 </m:r>
                 <m:f>
                   <m:fPr>
@@ -10673,7 +10651,7 @@
                                 <w:rFonts w:ascii="Cambria Math" w:hAnsi="Cambria Math"/>
                                 <w:sz w:val="26"/>
                               </w:rPr>
-                              <m:t>f</m:t>
+                              <m:t>X</m:t>
                             </m:r>
                           </m:e>
                           <m:sub>
@@ -10693,7 +10671,7 @@
                             <w:rFonts w:ascii="Cambria Math" w:hAnsi="Cambria Math"/>
                             <w:sz w:val="26"/>
                           </w:rPr>
-                          <m:t>+</m:t>
+                          <m:t>v</m:t>
                         </m:r>
                       </m:sup>
                     </m:sSup>
@@ -10702,7 +10680,7 @@
                         <w:rFonts w:ascii="Cambria Math" w:hAnsi="Cambria Math"/>
                         <w:sz w:val="26"/>
                       </w:rPr>
-                      <m:t>- |</m:t>
+                      <m:t xml:space="preserve">(1) - </m:t>
                     </m:r>
                     <m:sSup>
                       <m:sSupPr>
@@ -10727,7 +10705,7 @@
                                 <w:rFonts w:ascii="Cambria Math" w:hAnsi="Cambria Math"/>
                                 <w:sz w:val="26"/>
                               </w:rPr>
-                              <m:t>f</m:t>
+                              <m:t>X</m:t>
                             </m:r>
                           </m:e>
                           <m:sub>
@@ -10747,7 +10725,7 @@
                             <w:rFonts w:ascii="Cambria Math" w:hAnsi="Cambria Math"/>
                             <w:sz w:val="26"/>
                           </w:rPr>
-                          <m:t>-</m:t>
+                          <m:t>b</m:t>
                         </m:r>
                       </m:sup>
                     </m:sSup>
@@ -10756,39 +10734,73 @@
                         <w:rFonts w:ascii="Cambria Math" w:hAnsi="Cambria Math"/>
                         <w:sz w:val="26"/>
                       </w:rPr>
-                      <m:t>|</m:t>
+                      <m:t>(1)</m:t>
                     </m:r>
                   </m:num>
                   <m:den>
-                    <m:sSub>
-                      <m:sSubPr>
+                    <m:sSup>
+                      <m:sSupPr>
                         <m:ctrlPr>
                           <w:rPr>
                             <w:rFonts w:ascii="Cambria Math" w:hAnsi="Cambria Math"/>
                           </w:rPr>
                         </m:ctrlPr>
-                      </m:sSubPr>
+                      </m:sSupPr>
                       <m:e>
+                        <m:sSub>
+                          <m:sSubPr>
+                            <m:ctrlPr>
+                              <w:rPr>
+                                <w:rFonts w:ascii="Cambria Math" w:hAnsi="Cambria Math"/>
+                              </w:rPr>
+                            </m:ctrlPr>
+                          </m:sSubPr>
+                          <m:e>
+                            <m:r>
+                              <w:rPr>
+                                <w:rFonts w:ascii="Cambria Math" w:hAnsi="Cambria Math"/>
+                                <w:sz w:val="26"/>
+                              </w:rPr>
+                              <m:t>X</m:t>
+                            </m:r>
+                          </m:e>
+                          <m:sub>
+                            <m:r>
+                              <w:rPr>
+                                <w:rFonts w:ascii="Cambria Math" w:hAnsi="Cambria Math"/>
+                                <w:sz w:val="26"/>
+                              </w:rPr>
+                              <m:t>i</m:t>
+                            </m:r>
+                          </m:sub>
+                        </m:sSub>
+                      </m:e>
+                      <m:sup>
                         <m:r>
                           <w:rPr>
                             <w:rFonts w:ascii="Cambria Math" w:hAnsi="Cambria Math"/>
                             <w:sz w:val="26"/>
                           </w:rPr>
-                          <m:t>S</m:t>
+                          <m:t>b</m:t>
                         </m:r>
-                      </m:e>
-                      <m:sub>
-                        <m:r>
-                          <w:rPr>
-                            <w:rFonts w:ascii="Cambria Math" w:hAnsi="Cambria Math"/>
-                            <w:sz w:val="26"/>
-                          </w:rPr>
-                          <m:t>i</m:t>
-                        </m:r>
-                      </m:sub>
-                    </m:sSub>
+                      </m:sup>
+                    </m:sSup>
+                    <m:r>
+                      <w:rPr>
+                        <w:rFonts w:ascii="Cambria Math" w:hAnsi="Cambria Math"/>
+                        <w:sz w:val="26"/>
+                      </w:rPr>
+                      <m:t>(1)</m:t>
+                    </m:r>
                   </m:den>
                 </m:f>
+                <m:r>
+                  <w:rPr>
+                    <w:rFonts w:ascii="Cambria Math" w:hAnsi="Cambria Math"/>
+                    <w:sz w:val="26"/>
+                  </w:rPr>
+                  <m:t>.</m:t>
+                </m:r>
               </m:oMath>
             </m:oMathPara>
           </w:p>
@@ -10823,14 +10835,14 @@
     </w:tbl>
     <w:p>
       <w:r>
-        <w:t>Этот вариант удобен для вычислительного сравнения, но не объявляется исправленным физическим оригиналом. Он меняет смысл исходной системы. Более того, отрицательная f₃⁺ остаётся отрицательной, а для отдельных показателей по-прежнему отсутствуют насыщение и ресурсные ограничения. Для построения прикладной модели потребовалось бы заново обосновать функции, единицы и калибровку, а не только изменить знаки пяти коэффициентов.</w:t>
+        <w:t>Индексы b и v обозначают базовый и возмущённый сценарии. Если базовое значение равно нулю, относительное изменение не определено: в этом случае следует сравнивать абсолютную разность. Здесь все базовые конечные значения положительны. Знак Δᵢ показывает направление изменения характеристики, но сам по себе не определяет полезность или вредность изменения.</w:t>
       </w:r>
     </w:p>
     <w:p>
       <w:pPr>
         <w:pStyle w:val="1"/>
       </w:pPr>
-      <w:bookmarkStart w:id="13" w:name="_Toc243310434"/>
+      <w:bookmarkStart w:id="13" w:name="_Toc243312937"/>
       <w:r>
         <w:t>4 Численный метод</w:t>
       </w:r>
@@ -10840,7 +10852,7 @@
       <w:pPr>
         <w:pStyle w:val="2"/>
       </w:pPr>
-      <w:bookmarkStart w:id="14" w:name="_Toc243310435"/>
+      <w:bookmarkStart w:id="14" w:name="_Toc243312938"/>
       <w:r>
         <w:t>4.1 Адаптивное решение задачи Коши</w:t>
       </w:r>
@@ -11066,7 +11078,7 @@
       <w:pPr>
         <w:pStyle w:val="2"/>
       </w:pPr>
-      <w:bookmarkStart w:id="15" w:name="_Toc243310436"/>
+      <w:bookmarkStart w:id="15" w:name="_Toc243312939"/>
       <w:r>
         <w:t>4.2 Сетка вывода и четыре четверти интервала</w:t>
       </w:r>
@@ -11086,7 +11098,7 @@
       <w:pPr>
         <w:pStyle w:val="2"/>
       </w:pPr>
-      <w:bookmarkStart w:id="16" w:name="_Toc243310437"/>
+      <w:bookmarkStart w:id="16" w:name="_Toc243312940"/>
       <w:r>
         <w:t>4.3 Нормирование лепестковых диаграмм</w:t>
       </w:r>
@@ -11483,14 +11495,14 @@
     </w:p>
     <w:p>
       <w:r>
-        <w:t>При сравнении двух сценариев используется максимум соответствующих масштабов обоих расчётов. Отдельное нормирование каждой четверти скрывало бы часть изменений, поэтому оно не применяется. Площадь многоугольника не рассчитывается как совокупный риск: оси имеют разные смыслы, а эффективность оповещения и тяжесть последствий не должны без обоснования объединяться одним знаком полезности.</w:t>
+        <w:t>Все четыре диаграммы одного расчёта используют его неизменные масштабы Rᵢ. Сравнение с эталоном выполняется на временных графиках и по исходным числам таблицы, без смешения нормировок разных сценариев. Площадь многоугольника не рассчитывается как совокупный риск: оси имеют разные смыслы, а эффективность оповещения и тяжесть последствий не должны без обоснования объединяться одним знаком полезности.</w:t>
       </w:r>
     </w:p>
     <w:p>
       <w:pPr>
         <w:pStyle w:val="2"/>
       </w:pPr>
-      <w:bookmarkStart w:id="17" w:name="_Toc243310438"/>
+      <w:bookmarkStart w:id="17" w:name="_Toc243312941"/>
       <w:r>
         <w:t>4.4 Критерии численного сопоставления</w:t>
       </w:r>
@@ -11929,7 +11941,7 @@
       <w:pPr>
         <w:pStyle w:val="1"/>
       </w:pPr>
-      <w:bookmarkStart w:id="18" w:name="_Toc243310439"/>
+      <w:bookmarkStart w:id="18" w:name="_Toc243312942"/>
       <w:r>
         <w:t>5 Программная реализация</w:t>
       </w:r>
@@ -11939,7 +11951,7 @@
       <w:pPr>
         <w:pStyle w:val="2"/>
       </w:pPr>
-      <w:bookmarkStart w:id="19" w:name="_Toc243310440"/>
+      <w:bookmarkStart w:id="19" w:name="_Toc243312943"/>
       <w:r>
         <w:t>5.1 Архитектура и структура проекта</w:t>
       </w:r>
@@ -11971,7 +11983,7 @@
           <w:noProof/>
         </w:rPr>
         <w:drawing>
-          <wp:inline distT="0" distB="0" distL="0" distR="0" wp14:anchorId="04CC6AC5" wp14:editId="3128C529">
+          <wp:inline distT="0" distB="0" distL="0" distR="0" wp14:anchorId="3BA45539" wp14:editId="2A664E3D">
             <wp:extent cx="5220000" cy="2182740"/>
             <wp:effectExtent l="0" t="0" r="0" b="0"/>
             <wp:docPr id="1" name="Picture 1" descr="Архитектура приложения и обмен данными между компонентами"/>
@@ -12703,7 +12715,7 @@
       <w:pPr>
         <w:pStyle w:val="2"/>
       </w:pPr>
-      <w:bookmarkStart w:id="20" w:name="_Toc243310441"/>
+      <w:bookmarkStart w:id="20" w:name="_Toc243312944"/>
       <w:r>
         <w:t>5.2 Безопасный редактор уравнений</w:t>
       </w:r>
@@ -12728,7 +12740,7 @@
       <w:pPr>
         <w:pStyle w:val="2"/>
       </w:pPr>
-      <w:bookmarkStart w:id="21" w:name="_Toc243310442"/>
+      <w:bookmarkStart w:id="21" w:name="_Toc243312945"/>
       <w:r>
         <w:t>5.3 Численное ядро и API</w:t>
       </w:r>
@@ -12736,7 +12748,7 @@
     </w:p>
     <w:p>
       <w:r>
-        <w:t>Класс Dynamics вычисляет Fⱼ(τ), формирует окружение X и F, затем получает две части каждой производной. В буквальном режиме разность берётся со всеми исходными знаками; в режиме модулей преобразуется только вторая часть. Все делители Sᵢ положительны и проверяются до начала решения.</w:t>
+        <w:t>Класс Dynamics вычисляет Fⱼ(τ), формирует окружение X и F, затем получает две части каждой производной. Разность берётся со всеми исходными знаками, без преобразования отрицательных функций в модули. Все делители Sᵢ положительны и проверяются до начала решения.</w:t>
       </w:r>
     </w:p>
     <w:p>
@@ -12826,7 +12838,7 @@
       <w:pPr>
         <w:pStyle w:val="2"/>
       </w:pPr>
-      <w:bookmarkStart w:id="22" w:name="_Toc243310443"/>
+      <w:bookmarkStart w:id="22" w:name="_Toc243312946"/>
       <w:r>
         <w:t>5.4 Проверяемость и экспорт</w:t>
       </w:r>
@@ -12846,7 +12858,7 @@
       <w:pPr>
         <w:pStyle w:val="2"/>
       </w:pPr>
-      <w:bookmarkStart w:id="23" w:name="_Toc243310444"/>
+      <w:bookmarkStart w:id="23" w:name="_Toc243312947"/>
       <w:r>
         <w:t>5.5 Сборка и запуск</w:t>
       </w:r>
@@ -12871,7 +12883,7 @@
       <w:pPr>
         <w:pStyle w:val="1"/>
       </w:pPr>
-      <w:bookmarkStart w:id="24" w:name="_Toc243310445"/>
+      <w:bookmarkStart w:id="24" w:name="_Toc243312948"/>
       <w:r>
         <w:t>6 Пользовательский интерфейс</w:t>
       </w:r>
@@ -12881,7 +12893,7 @@
       <w:pPr>
         <w:pStyle w:val="2"/>
       </w:pPr>
-      <w:bookmarkStart w:id="25" w:name="_Toc243310446"/>
+      <w:bookmarkStart w:id="25" w:name="_Toc243312949"/>
       <w:r>
         <w:t>6.1 Настройка и просмотр динамики</w:t>
       </w:r>
@@ -12889,7 +12901,7 @@
     </w:p>
     <w:p>
       <w:r>
-        <w:t>Основной экран разделён на панель конфигурации и рабочую область. Слева выбираются сценарий, метод и соглашение о знаках; раскрывающиеся блоки содержат начальные условия, делители и настройки точности. Справа находятся выбранный временной профиль, числовые характеристики и все отдельные графики.</w:t>
+        <w:t>Основной экран разделён на панель конфигурации и рабочую область. Слева находятся сценарий и одиннадцать начальных условий, ниже – раскрывающиеся настройки решателя и делителей. Справа расположены шесть вкладок: «Динамика», «Все графики», «Внешние факторы», «Срезы», «Модель» и «Проверка». Оформление следует примеру [11]: белый фон, моноширинный текст, тонкие чёрные линии и прямоугольные элементы управления.</w:t>
       </w:r>
     </w:p>
     <w:p>
@@ -12913,7 +12925,7 @@
           <w:noProof/>
         </w:rPr>
         <w:drawing>
-          <wp:inline distT="0" distB="0" distL="0" distR="0" wp14:anchorId="04207537" wp14:editId="6C3D5EBF">
+          <wp:inline distT="0" distB="0" distL="0" distR="0" wp14:anchorId="31D44E88" wp14:editId="38D57F1D">
             <wp:extent cx="5832000" cy="4242857"/>
             <wp:effectExtent l="0" t="0" r="0" b="0"/>
             <wp:docPr id="2" name="Picture 2" descr="Основной экран с рассчитанным базовым сценарием"/>
@@ -12973,7 +12985,7 @@
       <w:pPr>
         <w:pStyle w:val="2"/>
       </w:pPr>
-      <w:bookmarkStart w:id="26" w:name="_Toc243310447"/>
+      <w:bookmarkStart w:id="26" w:name="_Toc243312950"/>
       <w:r>
         <w:t>6.2 Факторы и редактирование модели</w:t>
       </w:r>
@@ -12986,7 +12998,10 @@
     </w:p>
     <w:p>
       <w:r>
-        <w:t>Раздел уравнений содержит все 22 редактируемые алгебраические части. Рядом показаны названия характеристик и делители S. Справка объясняет доступный синтаксис, различие между табличной и графической редакциями задания и принятые режимы знаков. Благодаря этому эксперимент можно изменить без редактирования файлов Python.</w:t>
+        <w:t>Раздел уравнений содержит все 22 редактируемые алгебраические части. Рядом показаны названия характеристик и делители S. Формулы отображаются средствами KaTeX [13] как дроби, степени и индексы. Математическая запись строится из проверенного синтаксического дерева выполненного расчёта, поэтому она не является второй, независимо переписанной моделью. Справка объясняет синтаксис и различие между табличной и графической редакциями задания. Благодаря этому эксперимент можно изменить без редактирования файлов Pyt</w:t>
+      </w:r>
+      <w:r>
+        <w:t>hon.</w:t>
       </w:r>
     </w:p>
     <w:p>
@@ -13005,7 +13020,7 @@
           <w:noProof/>
         </w:rPr>
         <w:drawing>
-          <wp:inline distT="0" distB="0" distL="0" distR="0" wp14:anchorId="0968C631" wp14:editId="13880292">
+          <wp:inline distT="0" distB="0" distL="0" distR="0" wp14:anchorId="717A4EDA" wp14:editId="7C3000CB">
             <wp:extent cx="5832000" cy="4242857"/>
             <wp:effectExtent l="0" t="0" r="0" b="0"/>
             <wp:docPr id="3" name="Picture 3" descr="Экран задания временных зависимостей внешних факторов"/>
@@ -13072,7 +13087,7 @@
           <w:noProof/>
         </w:rPr>
         <w:drawing>
-          <wp:inline distT="0" distB="0" distL="0" distR="0" wp14:anchorId="63D75A6D" wp14:editId="57B4FB10">
+          <wp:inline distT="0" distB="0" distL="0" distR="0" wp14:anchorId="589B78D6" wp14:editId="5F7784C7">
             <wp:extent cx="5832000" cy="4242857"/>
             <wp:effectExtent l="0" t="0" r="0" b="0"/>
             <wp:docPr id="4" name="Picture 4" descr="Редактирование аналитических функций модели"/>
@@ -13127,7 +13142,7 @@
       <w:pPr>
         <w:pStyle w:val="2"/>
       </w:pPr>
-      <w:bookmarkStart w:id="27" w:name="_Toc243310448"/>
+      <w:bookmarkStart w:id="27" w:name="_Toc243312951"/>
       <w:r>
         <w:t>6.3 Лепестковые срезы и сравнение сценариев</w:t>
       </w:r>
@@ -13135,7 +13150,7 @@
     </w:p>
     <w:p>
       <w:r>
-        <w:t>Вкладка срезов показывает четыре состояния на общей лепестковой диаграмме и таблицу исходных чисел. Отдельный блок объясняет нормировку и перечисляет значения Rᵢ. Текст прямо указывает, что радиусы не являются общей оценкой риска.</w:t>
+        <w:t>Вкладка срезов показывает четыре отдельные лепестковые диаграммы и таблицу исходных чисел. Отдельный блок объясняет нормировку и перечисляет значения Rᵢ. Текст прямо указывает, что радиусы не являются общей оценкой риска.</w:t>
       </w:r>
     </w:p>
     <w:p>
@@ -13159,7 +13174,7 @@
           <w:noProof/>
         </w:rPr>
         <w:drawing>
-          <wp:inline distT="0" distB="0" distL="0" distR="0" wp14:anchorId="55106B21" wp14:editId="71EAB46A">
+          <wp:inline distT="0" distB="0" distL="0" distR="0" wp14:anchorId="072DBABC" wp14:editId="00617C1E">
             <wp:extent cx="5832000" cy="4242857"/>
             <wp:effectExtent l="0" t="0" r="0" b="0"/>
             <wp:docPr id="5" name="Picture 5" descr="Интерактивные лепестковые срезы и масштабы осей"/>
@@ -13214,7 +13229,7 @@
       <w:pPr>
         <w:pStyle w:val="2"/>
       </w:pPr>
-      <w:bookmarkStart w:id="28" w:name="_Toc243310449"/>
+      <w:bookmarkStart w:id="28" w:name="_Toc243312952"/>
       <w:r>
         <w:t>6.4 Проверка и обработка ошибочного ввода</w:t>
       </w:r>
@@ -13246,7 +13261,7 @@
           <w:noProof/>
         </w:rPr>
         <w:drawing>
-          <wp:inline distT="0" distB="0" distL="0" distR="0" wp14:anchorId="54184822" wp14:editId="4294237B">
+          <wp:inline distT="0" distB="0" distL="0" distR="0" wp14:anchorId="36E338C1" wp14:editId="4605243F">
             <wp:extent cx="5832000" cy="4242857"/>
             <wp:effectExtent l="0" t="0" r="0" b="0"/>
             <wp:docPr id="6" name="Picture 6" descr="Работающая встроенная проверка численного решения"/>
@@ -13301,7 +13316,7 @@
       <w:pPr>
         <w:pStyle w:val="1"/>
       </w:pPr>
-      <w:bookmarkStart w:id="29" w:name="_Toc243310450"/>
+      <w:bookmarkStart w:id="29" w:name="_Toc243312953"/>
       <w:r>
         <w:t>7 Верификация и вычислительные эксперименты</w:t>
       </w:r>
@@ -13311,7 +13326,7 @@
       <w:pPr>
         <w:pStyle w:val="2"/>
       </w:pPr>
-      <w:bookmarkStart w:id="30" w:name="_Toc243310451"/>
+      <w:bookmarkStart w:id="30" w:name="_Toc243312954"/>
       <w:r>
         <w:t>7.1 Аналитические и независимые численные проверки</w:t>
       </w:r>
@@ -14311,7 +14326,7 @@
           <w:noProof/>
         </w:rPr>
         <w:drawing>
-          <wp:inline distT="0" distB="0" distL="0" distR="0" wp14:anchorId="48220B70" wp14:editId="5D1D94CA">
+          <wp:inline distT="0" distB="0" distL="0" distR="0" wp14:anchorId="4E4C6ED6" wp14:editId="6544DB6F">
             <wp:extent cx="5832000" cy="2285403"/>
             <wp:effectExtent l="0" t="0" r="0" b="0"/>
             <wp:docPr id="7" name="Picture 7" descr="Ошибки аналитических и межметодных проверок"/>
@@ -14371,7 +14386,7 @@
       <w:pPr>
         <w:pStyle w:val="2"/>
       </w:pPr>
-      <w:bookmarkStart w:id="31" w:name="_Toc243310452"/>
+      <w:bookmarkStart w:id="31" w:name="_Toc243312955"/>
       <w:r>
         <w:t>7.2 Автоматические тесты и граничные случаи</w:t>
       </w:r>
@@ -14379,7 +14394,7 @@
     </w:p>
     <w:p>
       <w:r>
-        <w:t>Автоматический набор pytest содержит 45 успешно выполненных тестовых случаев. В него входят независимая арифметическая сверка всех табличных функций в исходной точке, четыре готовых сценария, точность срезов, неизменность несвязанных факторных профилей, редактирование обеих частей производной и проверки API. Отдельно проверяется отсутствие скрытого обрезания отрицательных решений.</w:t>
+        <w:t>Автоматический набор pytest содержит 52 успешно выполненных тестовых случаев. В него входят независимая арифметическая сверка всех табличных функций в исходной точке, четыре готовых сценария, точность срезов, неизменность несвязанных факторных профилей, редактирование обеих частей производной и проверки API. Отдельно проверяется отсутствие скрытого обрезания отрицательных решений.</w:t>
       </w:r>
     </w:p>
     <w:p>
@@ -14389,7 +14404,7 @@
     </w:p>
     <w:p>
       <w:r>
-        <w:t>В браузере пройдены 22 автоматизированных проверок: загрузка результатов Python, 11 временных графиков, воспроизведение и шаг, изменение формул, сравнение, живой протокол верификации, импорт JSON, экспорт CSV/JSON/PNG и мобильная ширина 390 px. Необработанных ошибок JavaScript в этом прогоне не обнаружено. Типизация TypeScript и production-сборка также завершены успешно.</w:t>
+        <w:t>В браузере пройдены 34 автоматизированных проверок: загрузка результатов Python, 11 временных графиков, воспроизведение и шаг, изменение формул, сравнение, живой протокол верификации, импорт JSON, экспорт CSV/JSON/PNG и мобильная ширина 390 px. Необработанных ошибок JavaScript в этом прогоне не обнаружено. Типизация TypeScript и production-сборка также завершены успешно.</w:t>
       </w:r>
     </w:p>
     <w:p>
@@ -14961,7 +14976,7 @@
       <w:pPr>
         <w:pStyle w:val="2"/>
       </w:pPr>
-      <w:bookmarkStart w:id="32" w:name="_Toc243310453"/>
+      <w:bookmarkStart w:id="32" w:name="_Toc243312956"/>
       <w:r>
         <w:t>7.3 Базовый сценарий</w:t>
       </w:r>
@@ -14969,12 +14984,12 @@
     </w:p>
     <w:p>
       <w:r>
-        <w:t>Все начальные условия и делители базового примера приведены в таблице 2, внешние факторы – в таблице 3. Конец интервала равен 1, используется буквальная обработка знаков. После расчёта получены 401 состояние и четыре точных по положению среза. Значения всех характеристик на этом интервале остаются положительными; X₁₁ также остаётся внутри 0…1.</w:t>
-      </w:r>
-    </w:p>
-    <w:p>
-      <w:r>
-        <w:t>Воспроизводимый отпечаток конфигурации: c9b92e7fe958e41b. В сохранённом прогоне выполнено 1502 вычислений правой стороны при максимальном шаге 0,01. Измеренное время включает вычисления на использованном компьютере и не является гарантией производительности на другой машине.</w:t>
+        <w:t>Все начальные условия и делители базового примера приведены в таблице 2, внешние факторы – в таблице 3. Конец интервала равен 1, исходные знаки коэффициентов сохранены. После расчёта получены 401 состояние и четыре точных по положению среза. Значения всех характеристик на этом интервале остаются положительными; X₁₁ также остаётся внутри 0…1.</w:t>
+      </w:r>
+    </w:p>
+    <w:p>
+      <w:r>
+        <w:t>Воспроизводимый отпечаток конфигурации: 623fcfc1cfe340e1. В сохранённом прогоне выполнено 1502 вычислений правой стороны при максимальном шаге 0,01. Измеренное время включает вычисления на использованном компьютере и не является гарантией производительности на другой машине.</w:t>
       </w:r>
     </w:p>
     <w:p>
@@ -14993,7 +15008,7 @@
           <w:noProof/>
         </w:rPr>
         <w:drawing>
-          <wp:inline distT="0" distB="0" distL="0" distR="0" wp14:anchorId="52E1DFB3" wp14:editId="3E4FB975">
+          <wp:inline distT="0" distB="0" distL="0" distR="0" wp14:anchorId="1DA32D68" wp14:editId="1811C0D5">
             <wp:extent cx="5832000" cy="6462893"/>
             <wp:effectExtent l="0" t="0" r="0" b="0"/>
             <wp:docPr id="8" name="Picture 8" descr="Временные зависимости характеристик X₁–X₆ базового сценария"/>
@@ -15060,7 +15075,7 @@
           <w:noProof/>
         </w:rPr>
         <w:drawing>
-          <wp:inline distT="0" distB="0" distL="0" distR="0" wp14:anchorId="138A98C5" wp14:editId="47137A2F">
+          <wp:inline distT="0" distB="0" distL="0" distR="0" wp14:anchorId="7C1F5AE1" wp14:editId="59EE7015">
             <wp:extent cx="5832000" cy="6462893"/>
             <wp:effectExtent l="0" t="0" r="0" b="0"/>
             <wp:docPr id="9" name="Picture 9" descr="Временные зависимости характеристик X₇–X₁₁ базового сценария"/>
@@ -16767,7 +16782,7 @@
       <w:pPr>
         <w:pStyle w:val="2"/>
       </w:pPr>
-      <w:bookmarkStart w:id="33" w:name="_Toc243310454"/>
+      <w:bookmarkStart w:id="33" w:name="_Toc243312957"/>
       <w:r>
         <w:t>7.4 Лепестковые диаграммы четырёх четвертей</w:t>
       </w:r>
@@ -16794,7 +16809,7 @@
           <w:noProof/>
         </w:rPr>
         <w:drawing>
-          <wp:inline distT="0" distB="0" distL="0" distR="0" wp14:anchorId="514334E4" wp14:editId="1A50E42D">
+          <wp:inline distT="0" distB="0" distL="0" distR="0" wp14:anchorId="2B4EC9B2" wp14:editId="089C7301">
             <wp:extent cx="5832000" cy="6061075"/>
             <wp:effectExtent l="0" t="0" r="0" b="0"/>
             <wp:docPr id="10" name="Picture 10" descr="Состояния модели в конце каждой четверти единичного интервала"/>
@@ -16854,7 +16869,7 @@
       <w:pPr>
         <w:pStyle w:val="2"/>
       </w:pPr>
-      <w:bookmarkStart w:id="34" w:name="_Toc243310455"/>
+      <w:bookmarkStart w:id="34" w:name="_Toc243312958"/>
       <w:r>
         <w:t>7.5 Изменение внешних факторов</w:t>
       </w:r>
@@ -16881,7 +16896,7 @@
           <w:noProof/>
         </w:rPr>
         <w:drawing>
-          <wp:inline distT="0" distB="0" distL="0" distR="0" wp14:anchorId="2C4E418E" wp14:editId="5135A8B2">
+          <wp:inline distT="0" distB="0" distL="0" distR="0" wp14:anchorId="74F4AFD2" wp14:editId="6A0A0FE9">
             <wp:extent cx="5832000" cy="6699477"/>
             <wp:effectExtent l="0" t="0" r="0" b="0"/>
             <wp:docPr id="11" name="Picture 11" descr="Заданные профили семи факторов и исследуемые возмущения"/>
@@ -16948,7 +16963,7 @@
           <w:noProof/>
         </w:rPr>
         <w:drawing>
-          <wp:inline distT="0" distB="0" distL="0" distR="0" wp14:anchorId="129592C7" wp14:editId="0F2C952B">
+          <wp:inline distT="0" distB="0" distL="0" distR="0" wp14:anchorId="1F114AF8" wp14:editId="7575C017">
             <wp:extent cx="5832000" cy="4468822"/>
             <wp:effectExtent l="0" t="0" r="0" b="0"/>
             <wp:docPr id="12" name="Picture 12" descr="Сопоставление базового сценария с изменением ветра и задержки"/>
@@ -17189,7 +17204,7 @@
                 <w:b/>
                 <w:sz w:val="24"/>
               </w:rPr>
-              <w:t>Модуль f⁻</w:t>
+              <w:t>Объём</w:t>
             </w:r>
           </w:p>
         </w:tc>
@@ -17320,7 +17335,7 @@
               <w:rPr>
                 <w:sz w:val="24"/>
               </w:rPr>
-              <w:t>0,731053</w:t>
+              <w:t>0,763068</w:t>
             </w:r>
           </w:p>
         </w:tc>
@@ -17451,7 +17466,7 @@
               <w:rPr>
                 <w:sz w:val="24"/>
               </w:rPr>
-              <w:t>0,439844</w:t>
+              <w:t>0,78148</w:t>
             </w:r>
           </w:p>
         </w:tc>
@@ -17582,7 +17597,7 @@
               <w:rPr>
                 <w:sz w:val="24"/>
               </w:rPr>
-              <w:t>0,730817</w:t>
+              <w:t>0,709059</w:t>
             </w:r>
           </w:p>
         </w:tc>
@@ -17713,7 +17728,7 @@
               <w:rPr>
                 <w:sz w:val="24"/>
               </w:rPr>
-              <w:t>0,810856</w:t>
+              <w:t>0,845109</w:t>
             </w:r>
           </w:p>
         </w:tc>
@@ -17844,7 +17859,7 @@
               <w:rPr>
                 <w:sz w:val="24"/>
               </w:rPr>
-              <w:t>0,114582</w:t>
+              <w:t>0,114049</w:t>
             </w:r>
           </w:p>
         </w:tc>
@@ -17975,7 +17990,7 @@
               <w:rPr>
                 <w:sz w:val="24"/>
               </w:rPr>
-              <w:t>0,0228589</w:t>
+              <w:t>0,280124</w:t>
             </w:r>
           </w:p>
         </w:tc>
@@ -18106,7 +18121,7 @@
               <w:rPr>
                 <w:sz w:val="24"/>
               </w:rPr>
-              <w:t>0,19301</w:t>
+              <w:t>0,234231</w:t>
             </w:r>
           </w:p>
         </w:tc>
@@ -18237,7 +18252,7 @@
               <w:rPr>
                 <w:sz w:val="24"/>
               </w:rPr>
-              <w:t>0,77515</w:t>
+              <w:t>0,844701</w:t>
             </w:r>
           </w:p>
         </w:tc>
@@ -18368,7 +18383,7 @@
               <w:rPr>
                 <w:sz w:val="24"/>
               </w:rPr>
-              <w:t>0,703146</w:t>
+              <w:t>0,70488</w:t>
             </w:r>
           </w:p>
         </w:tc>
@@ -18499,7 +18514,7 @@
               <w:rPr>
                 <w:sz w:val="24"/>
               </w:rPr>
-              <w:t>0,340668</w:t>
+              <w:t>0,340344</w:t>
             </w:r>
           </w:p>
         </w:tc>
@@ -18630,7 +18645,7 @@
               <w:rPr>
                 <w:sz w:val="24"/>
               </w:rPr>
-              <w:t>0,630316</w:t>
+              <w:t>0,630265</w:t>
             </w:r>
           </w:p>
         </w:tc>
@@ -18655,15 +18670,15 @@
       <w:pPr>
         <w:pStyle w:val="2"/>
       </w:pPr>
-      <w:bookmarkStart w:id="35" w:name="_Toc243310456"/>
-      <w:r>
-        <w:t>7.6 Чувствительность к соглашению о знаках</w:t>
+      <w:bookmarkStart w:id="35" w:name="_Toc243312959"/>
+      <w:r>
+        <w:t>7.6 Влияние объёма выброса</w:t>
       </w:r>
       <w:bookmarkEnd w:id="35"/>
     </w:p>
     <w:p>
       <w:r>
-        <w:t>Четвёртый эксперимент использует те же исходные условия, факторы и делители, но вычитает модуль f⁻. Это отдельная модификация модели. Сопоставление особенно важно для X₂ и X₆: в буквальном режиме их отрицательные f⁻ увеличивают производную, а в режиме модулей уменьшают её.</w:t>
+        <w:t>В четвёртом эксперименте постоянный фактор F₁ увеличен с 0,8 до 1,2, то есть на 50%. Все остальные параметры остаются базовыми. Этот фактор входит в положительные части первого и второго уравнений и в отрицательную часть третьего, а также в f₄⁻. Через обратные связи его изменение затрагивает другие характеристики.</w:t>
       </w:r>
     </w:p>
     <w:p>
@@ -18682,10 +18697,10 @@
           <w:noProof/>
         </w:rPr>
         <w:drawing>
-          <wp:inline distT="0" distB="0" distL="0" distR="0" wp14:anchorId="3C6340ED" wp14:editId="46BEA7AD">
+          <wp:inline distT="0" distB="0" distL="0" distR="0" wp14:anchorId="415734CE" wp14:editId="4991A5D1">
             <wp:extent cx="5832000" cy="2419980"/>
             <wp:effectExtent l="0" t="0" r="0" b="0"/>
-            <wp:docPr id="13" name="Picture 13" descr="Изменение траекторий при переходе от буквальных знаков к модулям"/>
+            <wp:docPr id="13" name="Picture 13" descr="Влияние увеличенного объёма выброса на характеристики X₂, X₆ и X₁₁"/>
             <wp:cNvGraphicFramePr>
               <a:graphicFrameLocks xmlns:a="http://schemas.openxmlformats.org/drawingml/2006/main" noChangeAspect="1"/>
             </wp:cNvGraphicFramePr>
@@ -18693,7 +18708,7 @@
               <a:graphicData uri="http://schemas.openxmlformats.org/drawingml/2006/picture">
                 <pic:pic xmlns:pic="http://schemas.openxmlformats.org/drawingml/2006/picture">
                   <pic:nvPicPr>
-                    <pic:cNvPr id="0" name="signs.png"/>
+                    <pic:cNvPr id="0" name="volume.png"/>
                     <pic:cNvPicPr/>
                   </pic:nvPicPr>
                   <pic:blipFill>
@@ -18730,24 +18745,24 @@
           <w:i/>
           <w:sz w:val="24"/>
         </w:rPr>
-        <w:t>Рисунок 13 – Изменение траекторий при переходе от буквальных знаков к модулям</w:t>
-      </w:r>
-    </w:p>
-    <w:p>
-      <w:r>
-        <w:t>Для X₆ итог меняется с 0,27941 до 0,0228589; для X₂ – с 0,778291 до 0,439844. Эти различия намного больше межметодной численной ошибки. Следовательно, уточнение математической постановки здесь важнее дальнейшего уменьшения rtol при неизменных знаках.</w:t>
-      </w:r>
-    </w:p>
-    <w:p>
-      <w:r>
-        <w:t>Малое расхождение численных методов не устраняет неоднозначность исходной модели. Для защиты работы следует различать три уровня: точность переноса табличных выражений, точность численного решения выбранной системы и достоверность её соответствия объекту. Первые два проверены вычислительно; третий требует исходных данных и отдельной валидации.</w:t>
+        <w:t>Рисунок 13 – Влияние увеличенного объёма выброса на характеристики X₂, X₆ и X₁₁</w:t>
+      </w:r>
+    </w:p>
+    <w:p>
+      <w:r>
+        <w:t>Для X₆ итог меняется с 0,27941 до 0,280124; относительная разность по формуле (13) равна 0,2553%. Для X₂ получено 0,78148 вместо 0,778291. Конечная площадь X₃ равна 0,709059. Эти числа вычислены рабочим ядром при неизменных исходных знаках.</w:t>
+      </w:r>
+    </w:p>
+    <w:p>
+      <w:r>
+        <w:t>Направления изменений объясняются структурой заданных функций, но не заменяют проверку модели по наблюдениям. Следует различать точность переноса табличных выражений, точность численного решения и достоверность соответствия реальному объекту. Первые два уровня проверены вычислительно; третий требует отсутствующих исходных данных.</w:t>
       </w:r>
     </w:p>
     <w:p>
       <w:pPr>
         <w:pStyle w:val="1"/>
       </w:pPr>
-      <w:bookmarkStart w:id="36" w:name="_Toc243310457"/>
+      <w:bookmarkStart w:id="36" w:name="_Toc243312960"/>
       <w:r>
         <w:t>8 Ограничения модели</w:t>
       </w:r>
@@ -18757,7 +18772,7 @@
       <w:pPr>
         <w:pStyle w:val="2"/>
       </w:pPr>
-      <w:bookmarkStart w:id="37" w:name="_Toc243310458"/>
+      <w:bookmarkStart w:id="37" w:name="_Toc243312961"/>
       <w:r>
         <w:t>8.1 Непроверенная физическая калибровка</w:t>
       </w:r>
@@ -18782,7 +18797,7 @@
       <w:pPr>
         <w:pStyle w:val="2"/>
       </w:pPr>
-      <w:bookmarkStart w:id="38" w:name="_Toc243310459"/>
+      <w:bookmarkStart w:id="38" w:name="_Toc243312962"/>
       <w:r>
         <w:t>8.2 Структурные и вычислительные ограничения</w:t>
       </w:r>
@@ -18790,7 +18805,7 @@
     </w:p>
     <w:p>
       <w:r>
-        <w:t>Система не описывает пространственную концентрацию, баланс массы выброшенного вещества, токсикологическую дозу, рельеф и застройку. В ней также нет полного набора законов насыщения, ограничений численности и доступности ресурсов. Изменение знаков f⁻ не добавляет эти механизмы. Готовые сценарии нужны для изучения поведения предоставленной модели.</w:t>
+        <w:t>Система не описывает пространственную концентрацию, баланс массы выброшенного вещества, токсикологическую дозу, рельеф и застройку. В ней также нет полного набора законов насыщения, ограничений численности и доступности ресурсов. Готовые сценарии нужны для изучения поведения предоставленной модели.</w:t>
       </w:r>
     </w:p>
     <w:p>
@@ -18807,7 +18822,7 @@
       <w:pPr>
         <w:pStyle w:val="1"/>
       </w:pPr>
-      <w:bookmarkStart w:id="39" w:name="_Toc243310460"/>
+      <w:bookmarkStart w:id="39" w:name="_Toc243312963"/>
       <w:r>
         <w:t>9 Заключение</w:t>
       </w:r>
@@ -18820,12 +18835,12 @@
     </w:p>
     <w:p>
       <w:r>
-        <w:t>Вычислительные эксперименты выполнены для базовых условий, нарастающего ветра, изменённой задержки оповещения и альтернативной обработки отрицательных членов. Для каждой четверти единичного интервала построены лепестковые диаграммы с общими масштабами. Таблицы и графики отчёта получены непосредственно из результатов рабочего ядра.</w:t>
-      </w:r>
-    </w:p>
-    <w:p>
-      <w:r>
-        <w:t>Корректность реализации подтверждена 45 автоматическими тестовыми случаями, 22 браузерными проверками, аналитическими решениями и сопоставлением трёх численных методов. Все заявленные численные критерии выполнены. Исследование знаков показало, что неоднозначность постановки влияет на результаты сильнее численной ошибки решателей.</w:t>
+        <w:t>Вычислительные эксперименты выполнены для базовых условий, нарастающего ветра, изменённой задержки оповещения и увеличенного объёма выброса. Для каждой четверти единичного интервала построены лепестковые диаграммы с общими масштабами. Таблицы и графики отчёта получены непосредственно из результатов рабочего ядра.</w:t>
+      </w:r>
+    </w:p>
+    <w:p>
+      <w:r>
+        <w:t>Корректность реализации подтверждена 52 автоматическими тестовыми случаями, 34 браузерными проверками, аналитическими решениями и сопоставлением трёх численных методов. Все заявленные численные критерии выполнены. Во всех четырёх экспериментах сохранена одна табличная система; менялись только явно указанные внешние условия.</w:t>
       </w:r>
     </w:p>
     <w:p>
@@ -18837,7 +18852,7 @@
       <w:pPr>
         <w:pStyle w:val="1"/>
       </w:pPr>
-      <w:bookmarkStart w:id="40" w:name="_Toc243310461"/>
+      <w:bookmarkStart w:id="40" w:name="_Toc243312964"/>
       <w:r>
         <w:t>Список использованных источников</w:t>
       </w:r>
@@ -19047,7 +19062,7 @@
         <w:ind w:left="397" w:hanging="397"/>
       </w:pPr>
       <w:r>
-        <w:t>11. greygn. rogue-wave-calc. Пример приложения для моделирования волн-убийц. Исходный код, использованный как ориентир по составу результата, без заимствования вычислительного ядра.</w:t>
+        <w:t>11. greygn. rogue-wave-calc. Пример приложения для моделирования волн-убийц. Исходный код, использованный как ориентир по интерфейсу и составу результата, без заимствования вычислительного ядра.</w:t>
       </w:r>
       <w:r>
         <w:t xml:space="preserve"> </w:t>
@@ -19083,9 +19098,30 @@
         </w:r>
       </w:hyperlink>
     </w:p>
+    <w:p>
+      <w:pPr>
+        <w:spacing w:after="140" w:line="252" w:lineRule="auto"/>
+        <w:ind w:left="397" w:hanging="397"/>
+      </w:pPr>
+      <w:r>
+        <w:t>13. KaTeX. API. Официальная документация библиотеки отображения математических выражений. Электронный ресурс.</w:t>
+      </w:r>
+      <w:r>
+        <w:t xml:space="preserve"> </w:t>
+      </w:r>
+      <w:hyperlink r:id="rId31">
+        <w:r>
+          <w:rPr>
+            <w:sz w:val="24"/>
+            <w:u w:val="single"/>
+          </w:rPr>
+          <w:t>Электронный текст</w:t>
+        </w:r>
+      </w:hyperlink>
+    </w:p>
     <w:sectPr>
-      <w:footerReference w:type="default" r:id="rId31"/>
-      <w:footerReference w:type="first" r:id="rId32"/>
+      <w:footerReference w:type="default" r:id="rId32"/>
+      <w:footerReference w:type="first" r:id="rId33"/>
       <w:pgSz w:w="11906" w:h="16838"/>
       <w:pgMar w:top="1134" w:right="850" w:bottom="1134" w:left="1701" w:header="708" w:footer="500" w:gutter="0"/>
       <w:cols w:space="720"/>
@@ -19364,19 +19400,19 @@
       <w:lvlJc w:val="left"/>
     </w:lvl>
   </w:abstractNum>
-  <w:num w:numId="1" w16cid:durableId="1123423672">
+  <w:num w:numId="1" w16cid:durableId="1686396453">
     <w:abstractNumId w:val="0"/>
     <w:lvlOverride w:ilvl="0">
       <w:startOverride w:val="1"/>
     </w:lvlOverride>
   </w:num>
-  <w:num w:numId="2" w16cid:durableId="1855458304">
+  <w:num w:numId="2" w16cid:durableId="1222056218">
     <w:abstractNumId w:val="2"/>
     <w:lvlOverride w:ilvl="0">
       <w:startOverride w:val="1"/>
     </w:lvlOverride>
   </w:num>
-  <w:num w:numId="3" w16cid:durableId="558437296">
+  <w:num w:numId="3" w16cid:durableId="357729">
     <w:abstractNumId w:val="1"/>
     <w:lvlOverride w:ilvl="0">
       <w:startOverride w:val="1"/>
@@ -20049,7 +20085,7 @@
     <w:autoRedefine/>
     <w:uiPriority w:val="39"/>
     <w:unhideWhenUsed/>
-    <w:rsid w:val="00565958"/>
+    <w:rsid w:val="00B1252B"/>
   </w:style>
   <w:style w:type="paragraph" w:styleId="20">
     <w:name w:val="toc 2"/>
@@ -20058,7 +20094,7 @@
     <w:autoRedefine/>
     <w:uiPriority w:val="39"/>
     <w:unhideWhenUsed/>
-    <w:rsid w:val="00565958"/>
+    <w:rsid w:val="00B1252B"/>
     <w:pPr>
       <w:ind w:left="280"/>
     </w:pPr>

</xml_diff>

<commit_message>
Publish Python simulation on GitHub Pages with Pyodide
</commit_message>
<xml_diff>
--- a/report/Практическая_работа_2_Химический_выброс.docx
+++ b/report/Практическая_работа_2_Химический_выброс.docx
@@ -177,7 +177,7 @@
         </w:rPr>
         <w:fldChar w:fldCharType="separate"/>
       </w:r>
-      <w:hyperlink w:anchor="_Toc243312924" w:history="1">
+      <w:hyperlink w:anchor="_Toc243483661" w:history="1">
         <w:r>
           <w:rPr>
             <w:rStyle w:val="a5"/>
@@ -208,7 +208,7 @@
             <w:webHidden/>
             <w:sz w:val="24"/>
           </w:rPr>
-          <w:instrText xml:space="preserve"> PAGEREF _Toc243312924 \h </w:instrText>
+          <w:instrText xml:space="preserve"> PAGEREF _Toc243483661 \h </w:instrText>
         </w:r>
         <w:r>
           <w:rPr>
@@ -261,7 +261,7 @@
           <w14:ligatures w14:val="standardContextual"/>
         </w:rPr>
       </w:pPr>
-      <w:hyperlink w:anchor="_Toc243312925" w:history="1">
+      <w:hyperlink w:anchor="_Toc243483662" w:history="1">
         <w:r>
           <w:rPr>
             <w:rStyle w:val="a5"/>
@@ -292,7 +292,7 @@
             <w:webHidden/>
             <w:sz w:val="24"/>
           </w:rPr>
-          <w:instrText xml:space="preserve"> PAGEREF _Toc243312925 \h </w:instrText>
+          <w:instrText xml:space="preserve"> PAGEREF _Toc243483662 \h </w:instrText>
         </w:r>
         <w:r>
           <w:rPr>
@@ -345,7 +345,7 @@
           <w14:ligatures w14:val="standardContextual"/>
         </w:rPr>
       </w:pPr>
-      <w:hyperlink w:anchor="_Toc243312926" w:history="1">
+      <w:hyperlink w:anchor="_Toc243483663" w:history="1">
         <w:r>
           <w:rPr>
             <w:rStyle w:val="a5"/>
@@ -376,7 +376,7 @@
             <w:webHidden/>
             <w:sz w:val="24"/>
           </w:rPr>
-          <w:instrText xml:space="preserve"> PAGEREF _Toc243312926 \h </w:instrText>
+          <w:instrText xml:space="preserve"> PAGEREF _Toc243483663 \h </w:instrText>
         </w:r>
         <w:r>
           <w:rPr>
@@ -429,7 +429,7 @@
           <w14:ligatures w14:val="standardContextual"/>
         </w:rPr>
       </w:pPr>
-      <w:hyperlink w:anchor="_Toc243312927" w:history="1">
+      <w:hyperlink w:anchor="_Toc243483664" w:history="1">
         <w:r>
           <w:rPr>
             <w:rStyle w:val="a5"/>
@@ -460,7 +460,7 @@
             <w:webHidden/>
             <w:sz w:val="24"/>
           </w:rPr>
-          <w:instrText xml:space="preserve"> PAGEREF _Toc243312927 \h </w:instrText>
+          <w:instrText xml:space="preserve"> PAGEREF _Toc243483664 \h </w:instrText>
         </w:r>
         <w:r>
           <w:rPr>
@@ -513,7 +513,7 @@
           <w14:ligatures w14:val="standardContextual"/>
         </w:rPr>
       </w:pPr>
-      <w:hyperlink w:anchor="_Toc243312928" w:history="1">
+      <w:hyperlink w:anchor="_Toc243483665" w:history="1">
         <w:r>
           <w:rPr>
             <w:rStyle w:val="a5"/>
@@ -544,7 +544,7 @@
             <w:webHidden/>
             <w:sz w:val="24"/>
           </w:rPr>
-          <w:instrText xml:space="preserve"> PAGEREF _Toc243312928 \h </w:instrText>
+          <w:instrText xml:space="preserve"> PAGEREF _Toc243483665 \h </w:instrText>
         </w:r>
         <w:r>
           <w:rPr>
@@ -597,7 +597,7 @@
           <w14:ligatures w14:val="standardContextual"/>
         </w:rPr>
       </w:pPr>
-      <w:hyperlink w:anchor="_Toc243312929" w:history="1">
+      <w:hyperlink w:anchor="_Toc243483666" w:history="1">
         <w:r>
           <w:rPr>
             <w:rStyle w:val="a5"/>
@@ -628,7 +628,7 @@
             <w:webHidden/>
             <w:sz w:val="24"/>
           </w:rPr>
-          <w:instrText xml:space="preserve"> PAGEREF _Toc243312929 \h </w:instrText>
+          <w:instrText xml:space="preserve"> PAGEREF _Toc243483666 \h </w:instrText>
         </w:r>
         <w:r>
           <w:rPr>
@@ -681,7 +681,7 @@
           <w14:ligatures w14:val="standardContextual"/>
         </w:rPr>
       </w:pPr>
-      <w:hyperlink w:anchor="_Toc243312930" w:history="1">
+      <w:hyperlink w:anchor="_Toc243483667" w:history="1">
         <w:r>
           <w:rPr>
             <w:rStyle w:val="a5"/>
@@ -712,7 +712,7 @@
             <w:webHidden/>
             <w:sz w:val="24"/>
           </w:rPr>
-          <w:instrText xml:space="preserve"> PAGEREF _Toc243312930 \h </w:instrText>
+          <w:instrText xml:space="preserve"> PAGEREF _Toc243483667 \h </w:instrText>
         </w:r>
         <w:r>
           <w:rPr>
@@ -765,7 +765,7 @@
           <w14:ligatures w14:val="standardContextual"/>
         </w:rPr>
       </w:pPr>
-      <w:hyperlink w:anchor="_Toc243312931" w:history="1">
+      <w:hyperlink w:anchor="_Toc243483668" w:history="1">
         <w:r>
           <w:rPr>
             <w:rStyle w:val="a5"/>
@@ -796,7 +796,7 @@
             <w:webHidden/>
             <w:sz w:val="24"/>
           </w:rPr>
-          <w:instrText xml:space="preserve"> PAGEREF _Toc243312931 \h </w:instrText>
+          <w:instrText xml:space="preserve"> PAGEREF _Toc243483668 \h </w:instrText>
         </w:r>
         <w:r>
           <w:rPr>
@@ -849,7 +849,7 @@
           <w14:ligatures w14:val="standardContextual"/>
         </w:rPr>
       </w:pPr>
-      <w:hyperlink w:anchor="_Toc243312932" w:history="1">
+      <w:hyperlink w:anchor="_Toc243483669" w:history="1">
         <w:r>
           <w:rPr>
             <w:rStyle w:val="a5"/>
@@ -880,7 +880,7 @@
             <w:webHidden/>
             <w:sz w:val="24"/>
           </w:rPr>
-          <w:instrText xml:space="preserve"> PAGEREF _Toc243312932 \h </w:instrText>
+          <w:instrText xml:space="preserve"> PAGEREF _Toc243483669 \h </w:instrText>
         </w:r>
         <w:r>
           <w:rPr>
@@ -933,7 +933,7 @@
           <w14:ligatures w14:val="standardContextual"/>
         </w:rPr>
       </w:pPr>
-      <w:hyperlink w:anchor="_Toc243312933" w:history="1">
+      <w:hyperlink w:anchor="_Toc243483670" w:history="1">
         <w:r>
           <w:rPr>
             <w:rStyle w:val="a5"/>
@@ -964,7 +964,7 @@
             <w:webHidden/>
             <w:sz w:val="24"/>
           </w:rPr>
-          <w:instrText xml:space="preserve"> PAGEREF _Toc243312933 \h </w:instrText>
+          <w:instrText xml:space="preserve"> PAGEREF _Toc243483670 \h </w:instrText>
         </w:r>
         <w:r>
           <w:rPr>
@@ -1017,7 +1017,7 @@
           <w14:ligatures w14:val="standardContextual"/>
         </w:rPr>
       </w:pPr>
-      <w:hyperlink w:anchor="_Toc243312934" w:history="1">
+      <w:hyperlink w:anchor="_Toc243483671" w:history="1">
         <w:r>
           <w:rPr>
             <w:rStyle w:val="a5"/>
@@ -1048,7 +1048,7 @@
             <w:webHidden/>
             <w:sz w:val="24"/>
           </w:rPr>
-          <w:instrText xml:space="preserve"> PAGEREF _Toc243312934 \h </w:instrText>
+          <w:instrText xml:space="preserve"> PAGEREF _Toc243483671 \h </w:instrText>
         </w:r>
         <w:r>
           <w:rPr>
@@ -1101,7 +1101,7 @@
           <w14:ligatures w14:val="standardContextual"/>
         </w:rPr>
       </w:pPr>
-      <w:hyperlink w:anchor="_Toc243312935" w:history="1">
+      <w:hyperlink w:anchor="_Toc243483672" w:history="1">
         <w:r>
           <w:rPr>
             <w:rStyle w:val="a5"/>
@@ -1132,7 +1132,7 @@
             <w:webHidden/>
             <w:sz w:val="24"/>
           </w:rPr>
-          <w:instrText xml:space="preserve"> PAGEREF _Toc243312935 \h </w:instrText>
+          <w:instrText xml:space="preserve"> PAGEREF _Toc243483672 \h </w:instrText>
         </w:r>
         <w:r>
           <w:rPr>
@@ -1185,7 +1185,7 @@
           <w14:ligatures w14:val="standardContextual"/>
         </w:rPr>
       </w:pPr>
-      <w:hyperlink w:anchor="_Toc243312936" w:history="1">
+      <w:hyperlink w:anchor="_Toc243483673" w:history="1">
         <w:r>
           <w:rPr>
             <w:rStyle w:val="a5"/>
@@ -1216,7 +1216,7 @@
             <w:webHidden/>
             <w:sz w:val="24"/>
           </w:rPr>
-          <w:instrText xml:space="preserve"> PAGEREF _Toc243312936 \h </w:instrText>
+          <w:instrText xml:space="preserve"> PAGEREF _Toc243483673 \h </w:instrText>
         </w:r>
         <w:r>
           <w:rPr>
@@ -1269,7 +1269,7 @@
           <w14:ligatures w14:val="standardContextual"/>
         </w:rPr>
       </w:pPr>
-      <w:hyperlink w:anchor="_Toc243312937" w:history="1">
+      <w:hyperlink w:anchor="_Toc243483674" w:history="1">
         <w:r>
           <w:rPr>
             <w:rStyle w:val="a5"/>
@@ -1300,7 +1300,7 @@
             <w:webHidden/>
             <w:sz w:val="24"/>
           </w:rPr>
-          <w:instrText xml:space="preserve"> PAGEREF _Toc243312937 \h </w:instrText>
+          <w:instrText xml:space="preserve"> PAGEREF _Toc243483674 \h </w:instrText>
         </w:r>
         <w:r>
           <w:rPr>
@@ -1353,7 +1353,7 @@
           <w14:ligatures w14:val="standardContextual"/>
         </w:rPr>
       </w:pPr>
-      <w:hyperlink w:anchor="_Toc243312938" w:history="1">
+      <w:hyperlink w:anchor="_Toc243483675" w:history="1">
         <w:r>
           <w:rPr>
             <w:rStyle w:val="a5"/>
@@ -1384,7 +1384,7 @@
             <w:webHidden/>
             <w:sz w:val="24"/>
           </w:rPr>
-          <w:instrText xml:space="preserve"> PAGEREF _Toc243312938 \h </w:instrText>
+          <w:instrText xml:space="preserve"> PAGEREF _Toc243483675 \h </w:instrText>
         </w:r>
         <w:r>
           <w:rPr>
@@ -1437,7 +1437,7 @@
           <w14:ligatures w14:val="standardContextual"/>
         </w:rPr>
       </w:pPr>
-      <w:hyperlink w:anchor="_Toc243312939" w:history="1">
+      <w:hyperlink w:anchor="_Toc243483676" w:history="1">
         <w:r>
           <w:rPr>
             <w:rStyle w:val="a5"/>
@@ -1468,7 +1468,7 @@
             <w:webHidden/>
             <w:sz w:val="24"/>
           </w:rPr>
-          <w:instrText xml:space="preserve"> PAGEREF _Toc243312939 \h </w:instrText>
+          <w:instrText xml:space="preserve"> PAGEREF _Toc243483676 \h </w:instrText>
         </w:r>
         <w:r>
           <w:rPr>
@@ -1521,7 +1521,7 @@
           <w14:ligatures w14:val="standardContextual"/>
         </w:rPr>
       </w:pPr>
-      <w:hyperlink w:anchor="_Toc243312940" w:history="1">
+      <w:hyperlink w:anchor="_Toc243483677" w:history="1">
         <w:r>
           <w:rPr>
             <w:rStyle w:val="a5"/>
@@ -1552,7 +1552,7 @@
             <w:webHidden/>
             <w:sz w:val="24"/>
           </w:rPr>
-          <w:instrText xml:space="preserve"> PAGEREF _Toc243312940 \h </w:instrText>
+          <w:instrText xml:space="preserve"> PAGEREF _Toc243483677 \h </w:instrText>
         </w:r>
         <w:r>
           <w:rPr>
@@ -1605,7 +1605,7 @@
           <w14:ligatures w14:val="standardContextual"/>
         </w:rPr>
       </w:pPr>
-      <w:hyperlink w:anchor="_Toc243312941" w:history="1">
+      <w:hyperlink w:anchor="_Toc243483678" w:history="1">
         <w:r>
           <w:rPr>
             <w:rStyle w:val="a5"/>
@@ -1636,7 +1636,7 @@
             <w:webHidden/>
             <w:sz w:val="24"/>
           </w:rPr>
-          <w:instrText xml:space="preserve"> PAGEREF _Toc243312941 \h </w:instrText>
+          <w:instrText xml:space="preserve"> PAGEREF _Toc243483678 \h </w:instrText>
         </w:r>
         <w:r>
           <w:rPr>
@@ -1689,7 +1689,7 @@
           <w14:ligatures w14:val="standardContextual"/>
         </w:rPr>
       </w:pPr>
-      <w:hyperlink w:anchor="_Toc243312942" w:history="1">
+      <w:hyperlink w:anchor="_Toc243483679" w:history="1">
         <w:r>
           <w:rPr>
             <w:rStyle w:val="a5"/>
@@ -1720,7 +1720,7 @@
             <w:webHidden/>
             <w:sz w:val="24"/>
           </w:rPr>
-          <w:instrText xml:space="preserve"> PAGEREF _Toc243312942 \h </w:instrText>
+          <w:instrText xml:space="preserve"> PAGEREF _Toc243483679 \h </w:instrText>
         </w:r>
         <w:r>
           <w:rPr>
@@ -1773,7 +1773,7 @@
           <w14:ligatures w14:val="standardContextual"/>
         </w:rPr>
       </w:pPr>
-      <w:hyperlink w:anchor="_Toc243312943" w:history="1">
+      <w:hyperlink w:anchor="_Toc243483680" w:history="1">
         <w:r>
           <w:rPr>
             <w:rStyle w:val="a5"/>
@@ -1804,7 +1804,7 @@
             <w:webHidden/>
             <w:sz w:val="24"/>
           </w:rPr>
-          <w:instrText xml:space="preserve"> PAGEREF _Toc243312943 \h </w:instrText>
+          <w:instrText xml:space="preserve"> PAGEREF _Toc243483680 \h </w:instrText>
         </w:r>
         <w:r>
           <w:rPr>
@@ -1857,7 +1857,7 @@
           <w14:ligatures w14:val="standardContextual"/>
         </w:rPr>
       </w:pPr>
-      <w:hyperlink w:anchor="_Toc243312944" w:history="1">
+      <w:hyperlink w:anchor="_Toc243483681" w:history="1">
         <w:r>
           <w:rPr>
             <w:rStyle w:val="a5"/>
@@ -1888,7 +1888,7 @@
             <w:webHidden/>
             <w:sz w:val="24"/>
           </w:rPr>
-          <w:instrText xml:space="preserve"> PAGEREF _Toc243312944 \h </w:instrText>
+          <w:instrText xml:space="preserve"> PAGEREF _Toc243483681 \h </w:instrText>
         </w:r>
         <w:r>
           <w:rPr>
@@ -1941,7 +1941,7 @@
           <w14:ligatures w14:val="standardContextual"/>
         </w:rPr>
       </w:pPr>
-      <w:hyperlink w:anchor="_Toc243312945" w:history="1">
+      <w:hyperlink w:anchor="_Toc243483682" w:history="1">
         <w:r>
           <w:rPr>
             <w:rStyle w:val="a5"/>
@@ -1972,7 +1972,7 @@
             <w:webHidden/>
             <w:sz w:val="24"/>
           </w:rPr>
-          <w:instrText xml:space="preserve"> PAGEREF _Toc243312945 \h </w:instrText>
+          <w:instrText xml:space="preserve"> PAGEREF _Toc243483682 \h </w:instrText>
         </w:r>
         <w:r>
           <w:rPr>
@@ -2025,7 +2025,7 @@
           <w14:ligatures w14:val="standardContextual"/>
         </w:rPr>
       </w:pPr>
-      <w:hyperlink w:anchor="_Toc243312946" w:history="1">
+      <w:hyperlink w:anchor="_Toc243483683" w:history="1">
         <w:r>
           <w:rPr>
             <w:rStyle w:val="a5"/>
@@ -2056,7 +2056,7 @@
             <w:webHidden/>
             <w:sz w:val="24"/>
           </w:rPr>
-          <w:instrText xml:space="preserve"> PAGEREF _Toc243312946 \h </w:instrText>
+          <w:instrText xml:space="preserve"> PAGEREF _Toc243483683 \h </w:instrText>
         </w:r>
         <w:r>
           <w:rPr>
@@ -2109,7 +2109,7 @@
           <w14:ligatures w14:val="standardContextual"/>
         </w:rPr>
       </w:pPr>
-      <w:hyperlink w:anchor="_Toc243312947" w:history="1">
+      <w:hyperlink w:anchor="_Toc243483684" w:history="1">
         <w:r>
           <w:rPr>
             <w:rStyle w:val="a5"/>
@@ -2140,7 +2140,7 @@
             <w:webHidden/>
             <w:sz w:val="24"/>
           </w:rPr>
-          <w:instrText xml:space="preserve"> PAGEREF _Toc243312947 \h </w:instrText>
+          <w:instrText xml:space="preserve"> PAGEREF _Toc243483684 \h </w:instrText>
         </w:r>
         <w:r>
           <w:rPr>
@@ -2193,7 +2193,7 @@
           <w14:ligatures w14:val="standardContextual"/>
         </w:rPr>
       </w:pPr>
-      <w:hyperlink w:anchor="_Toc243312948" w:history="1">
+      <w:hyperlink w:anchor="_Toc243483685" w:history="1">
         <w:r>
           <w:rPr>
             <w:rStyle w:val="a5"/>
@@ -2224,7 +2224,7 @@
             <w:webHidden/>
             <w:sz w:val="24"/>
           </w:rPr>
-          <w:instrText xml:space="preserve"> PAGEREF _Toc243312948 \h </w:instrText>
+          <w:instrText xml:space="preserve"> PAGEREF _Toc243483685 \h </w:instrText>
         </w:r>
         <w:r>
           <w:rPr>
@@ -2277,7 +2277,7 @@
           <w14:ligatures w14:val="standardContextual"/>
         </w:rPr>
       </w:pPr>
-      <w:hyperlink w:anchor="_Toc243312949" w:history="1">
+      <w:hyperlink w:anchor="_Toc243483686" w:history="1">
         <w:r>
           <w:rPr>
             <w:rStyle w:val="a5"/>
@@ -2308,7 +2308,7 @@
             <w:webHidden/>
             <w:sz w:val="24"/>
           </w:rPr>
-          <w:instrText xml:space="preserve"> PAGEREF _Toc243312949 \h </w:instrText>
+          <w:instrText xml:space="preserve"> PAGEREF _Toc243483686 \h </w:instrText>
         </w:r>
         <w:r>
           <w:rPr>
@@ -2361,7 +2361,7 @@
           <w14:ligatures w14:val="standardContextual"/>
         </w:rPr>
       </w:pPr>
-      <w:hyperlink w:anchor="_Toc243312950" w:history="1">
+      <w:hyperlink w:anchor="_Toc243483687" w:history="1">
         <w:r>
           <w:rPr>
             <w:rStyle w:val="a5"/>
@@ -2392,7 +2392,7 @@
             <w:webHidden/>
             <w:sz w:val="24"/>
           </w:rPr>
-          <w:instrText xml:space="preserve"> PAGEREF _Toc243312950 \h </w:instrText>
+          <w:instrText xml:space="preserve"> PAGEREF _Toc243483687 \h </w:instrText>
         </w:r>
         <w:r>
           <w:rPr>
@@ -2445,7 +2445,7 @@
           <w14:ligatures w14:val="standardContextual"/>
         </w:rPr>
       </w:pPr>
-      <w:hyperlink w:anchor="_Toc243312951" w:history="1">
+      <w:hyperlink w:anchor="_Toc243483688" w:history="1">
         <w:r>
           <w:rPr>
             <w:rStyle w:val="a5"/>
@@ -2476,7 +2476,7 @@
             <w:webHidden/>
             <w:sz w:val="24"/>
           </w:rPr>
-          <w:instrText xml:space="preserve"> PAGEREF _Toc243312951 \h </w:instrText>
+          <w:instrText xml:space="preserve"> PAGEREF _Toc243483688 \h </w:instrText>
         </w:r>
         <w:r>
           <w:rPr>
@@ -2529,7 +2529,7 @@
           <w14:ligatures w14:val="standardContextual"/>
         </w:rPr>
       </w:pPr>
-      <w:hyperlink w:anchor="_Toc243312952" w:history="1">
+      <w:hyperlink w:anchor="_Toc243483689" w:history="1">
         <w:r>
           <w:rPr>
             <w:rStyle w:val="a5"/>
@@ -2560,7 +2560,7 @@
             <w:webHidden/>
             <w:sz w:val="24"/>
           </w:rPr>
-          <w:instrText xml:space="preserve"> PAGEREF _Toc243312952 \h </w:instrText>
+          <w:instrText xml:space="preserve"> PAGEREF _Toc243483689 \h </w:instrText>
         </w:r>
         <w:r>
           <w:rPr>
@@ -2613,7 +2613,7 @@
           <w14:ligatures w14:val="standardContextual"/>
         </w:rPr>
       </w:pPr>
-      <w:hyperlink w:anchor="_Toc243312953" w:history="1">
+      <w:hyperlink w:anchor="_Toc243483690" w:history="1">
         <w:r>
           <w:rPr>
             <w:rStyle w:val="a5"/>
@@ -2644,7 +2644,7 @@
             <w:webHidden/>
             <w:sz w:val="24"/>
           </w:rPr>
-          <w:instrText xml:space="preserve"> PAGEREF _Toc243312953 \h </w:instrText>
+          <w:instrText xml:space="preserve"> PAGEREF _Toc243483690 \h </w:instrText>
         </w:r>
         <w:r>
           <w:rPr>
@@ -2697,7 +2697,7 @@
           <w14:ligatures w14:val="standardContextual"/>
         </w:rPr>
       </w:pPr>
-      <w:hyperlink w:anchor="_Toc243312954" w:history="1">
+      <w:hyperlink w:anchor="_Toc243483691" w:history="1">
         <w:r>
           <w:rPr>
             <w:rStyle w:val="a5"/>
@@ -2728,7 +2728,7 @@
             <w:webHidden/>
             <w:sz w:val="24"/>
           </w:rPr>
-          <w:instrText xml:space="preserve"> PAGEREF _Toc243312954 \h </w:instrText>
+          <w:instrText xml:space="preserve"> PAGEREF _Toc243483691 \h </w:instrText>
         </w:r>
         <w:r>
           <w:rPr>
@@ -2781,7 +2781,7 @@
           <w14:ligatures w14:val="standardContextual"/>
         </w:rPr>
       </w:pPr>
-      <w:hyperlink w:anchor="_Toc243312955" w:history="1">
+      <w:hyperlink w:anchor="_Toc243483692" w:history="1">
         <w:r>
           <w:rPr>
             <w:rStyle w:val="a5"/>
@@ -2812,7 +2812,7 @@
             <w:webHidden/>
             <w:sz w:val="24"/>
           </w:rPr>
-          <w:instrText xml:space="preserve"> PAGEREF _Toc243312955 \h </w:instrText>
+          <w:instrText xml:space="preserve"> PAGEREF _Toc243483692 \h </w:instrText>
         </w:r>
         <w:r>
           <w:rPr>
@@ -2865,7 +2865,7 @@
           <w14:ligatures w14:val="standardContextual"/>
         </w:rPr>
       </w:pPr>
-      <w:hyperlink w:anchor="_Toc243312956" w:history="1">
+      <w:hyperlink w:anchor="_Toc243483693" w:history="1">
         <w:r>
           <w:rPr>
             <w:rStyle w:val="a5"/>
@@ -2896,7 +2896,7 @@
             <w:webHidden/>
             <w:sz w:val="24"/>
           </w:rPr>
-          <w:instrText xml:space="preserve"> PAGEREF _Toc243312956 \h </w:instrText>
+          <w:instrText xml:space="preserve"> PAGEREF _Toc243483693 \h </w:instrText>
         </w:r>
         <w:r>
           <w:rPr>
@@ -2919,7 +2919,7 @@
             <w:webHidden/>
             <w:sz w:val="24"/>
           </w:rPr>
-          <w:t>22</w:t>
+          <w:t>23</w:t>
         </w:r>
         <w:r>
           <w:rPr>
@@ -2949,7 +2949,7 @@
           <w14:ligatures w14:val="standardContextual"/>
         </w:rPr>
       </w:pPr>
-      <w:hyperlink w:anchor="_Toc243312957" w:history="1">
+      <w:hyperlink w:anchor="_Toc243483694" w:history="1">
         <w:r>
           <w:rPr>
             <w:rStyle w:val="a5"/>
@@ -2980,7 +2980,7 @@
             <w:webHidden/>
             <w:sz w:val="24"/>
           </w:rPr>
-          <w:instrText xml:space="preserve"> PAGEREF _Toc243312957 \h </w:instrText>
+          <w:instrText xml:space="preserve"> PAGEREF _Toc243483694 \h </w:instrText>
         </w:r>
         <w:r>
           <w:rPr>
@@ -3033,7 +3033,7 @@
           <w14:ligatures w14:val="standardContextual"/>
         </w:rPr>
       </w:pPr>
-      <w:hyperlink w:anchor="_Toc243312958" w:history="1">
+      <w:hyperlink w:anchor="_Toc243483695" w:history="1">
         <w:r>
           <w:rPr>
             <w:rStyle w:val="a5"/>
@@ -3064,7 +3064,7 @@
             <w:webHidden/>
             <w:sz w:val="24"/>
           </w:rPr>
-          <w:instrText xml:space="preserve"> PAGEREF _Toc243312958 \h </w:instrText>
+          <w:instrText xml:space="preserve"> PAGEREF _Toc243483695 \h </w:instrText>
         </w:r>
         <w:r>
           <w:rPr>
@@ -3117,7 +3117,7 @@
           <w14:ligatures w14:val="standardContextual"/>
         </w:rPr>
       </w:pPr>
-      <w:hyperlink w:anchor="_Toc243312959" w:history="1">
+      <w:hyperlink w:anchor="_Toc243483696" w:history="1">
         <w:r>
           <w:rPr>
             <w:rStyle w:val="a5"/>
@@ -3148,7 +3148,7 @@
             <w:webHidden/>
             <w:sz w:val="24"/>
           </w:rPr>
-          <w:instrText xml:space="preserve"> PAGEREF _Toc243312959 \h </w:instrText>
+          <w:instrText xml:space="preserve"> PAGEREF _Toc243483696 \h </w:instrText>
         </w:r>
         <w:r>
           <w:rPr>
@@ -3201,7 +3201,7 @@
           <w14:ligatures w14:val="standardContextual"/>
         </w:rPr>
       </w:pPr>
-      <w:hyperlink w:anchor="_Toc243312960" w:history="1">
+      <w:hyperlink w:anchor="_Toc243483697" w:history="1">
         <w:r>
           <w:rPr>
             <w:rStyle w:val="a5"/>
@@ -3232,7 +3232,7 @@
             <w:webHidden/>
             <w:sz w:val="24"/>
           </w:rPr>
-          <w:instrText xml:space="preserve"> PAGEREF _Toc243312960 \h </w:instrText>
+          <w:instrText xml:space="preserve"> PAGEREF _Toc243483697 \h </w:instrText>
         </w:r>
         <w:r>
           <w:rPr>
@@ -3285,7 +3285,7 @@
           <w14:ligatures w14:val="standardContextual"/>
         </w:rPr>
       </w:pPr>
-      <w:hyperlink w:anchor="_Toc243312961" w:history="1">
+      <w:hyperlink w:anchor="_Toc243483698" w:history="1">
         <w:r>
           <w:rPr>
             <w:rStyle w:val="a5"/>
@@ -3316,7 +3316,7 @@
             <w:webHidden/>
             <w:sz w:val="24"/>
           </w:rPr>
-          <w:instrText xml:space="preserve"> PAGEREF _Toc243312961 \h </w:instrText>
+          <w:instrText xml:space="preserve"> PAGEREF _Toc243483698 \h </w:instrText>
         </w:r>
         <w:r>
           <w:rPr>
@@ -3369,7 +3369,7 @@
           <w14:ligatures w14:val="standardContextual"/>
         </w:rPr>
       </w:pPr>
-      <w:hyperlink w:anchor="_Toc243312962" w:history="1">
+      <w:hyperlink w:anchor="_Toc243483699" w:history="1">
         <w:r>
           <w:rPr>
             <w:rStyle w:val="a5"/>
@@ -3400,7 +3400,7 @@
             <w:webHidden/>
             <w:sz w:val="24"/>
           </w:rPr>
-          <w:instrText xml:space="preserve"> PAGEREF _Toc243312962 \h </w:instrText>
+          <w:instrText xml:space="preserve"> PAGEREF _Toc243483699 \h </w:instrText>
         </w:r>
         <w:r>
           <w:rPr>
@@ -3453,7 +3453,7 @@
           <w14:ligatures w14:val="standardContextual"/>
         </w:rPr>
       </w:pPr>
-      <w:hyperlink w:anchor="_Toc243312963" w:history="1">
+      <w:hyperlink w:anchor="_Toc243483700" w:history="1">
         <w:r>
           <w:rPr>
             <w:rStyle w:val="a5"/>
@@ -3484,7 +3484,7 @@
             <w:webHidden/>
             <w:sz w:val="24"/>
           </w:rPr>
-          <w:instrText xml:space="preserve"> PAGEREF _Toc243312963 \h </w:instrText>
+          <w:instrText xml:space="preserve"> PAGEREF _Toc243483700 \h </w:instrText>
         </w:r>
         <w:r>
           <w:rPr>
@@ -3537,7 +3537,7 @@
           <w14:ligatures w14:val="standardContextual"/>
         </w:rPr>
       </w:pPr>
-      <w:hyperlink w:anchor="_Toc243312964" w:history="1">
+      <w:hyperlink w:anchor="_Toc243483701" w:history="1">
         <w:r>
           <w:rPr>
             <w:rStyle w:val="a5"/>
@@ -3568,7 +3568,7 @@
             <w:webHidden/>
             <w:sz w:val="24"/>
           </w:rPr>
-          <w:instrText xml:space="preserve"> PAGEREF _Toc243312964 \h </w:instrText>
+          <w:instrText xml:space="preserve"> PAGEREF _Toc243483701 \h </w:instrText>
         </w:r>
         <w:r>
           <w:rPr>
@@ -3624,7 +3624,7 @@
       <w:pPr>
         <w:pStyle w:val="1"/>
       </w:pPr>
-      <w:bookmarkStart w:id="0" w:name="_Toc243312924"/>
+      <w:bookmarkStart w:id="0" w:name="_Toc243483661"/>
       <w:r>
         <w:t>1 Постановка задачи</w:t>
       </w:r>
@@ -3649,7 +3649,7 @@
       <w:pPr>
         <w:pStyle w:val="2"/>
       </w:pPr>
-      <w:bookmarkStart w:id="1" w:name="_Toc243312925"/>
+      <w:bookmarkStart w:id="1" w:name="_Toc243483662"/>
       <w:r>
         <w:t>1.1 Требования к программе</w:t>
       </w:r>
@@ -4224,7 +4224,7 @@
       <w:pPr>
         <w:pStyle w:val="2"/>
       </w:pPr>
-      <w:bookmarkStart w:id="2" w:name="_Toc243312926"/>
+      <w:bookmarkStart w:id="2" w:name="_Toc243483663"/>
       <w:r>
         <w:t>1.2 Состав результата</w:t>
       </w:r>
@@ -4244,7 +4244,7 @@
       <w:pPr>
         <w:pStyle w:val="1"/>
       </w:pPr>
-      <w:bookmarkStart w:id="3" w:name="_Toc243312927"/>
+      <w:bookmarkStart w:id="3" w:name="_Toc243483664"/>
       <w:r>
         <w:t>2 Предметная область</w:t>
       </w:r>
@@ -4254,7 +4254,7 @@
       <w:pPr>
         <w:pStyle w:val="2"/>
       </w:pPr>
-      <w:bookmarkStart w:id="4" w:name="_Toc243312928"/>
+      <w:bookmarkStart w:id="4" w:name="_Toc243483665"/>
       <w:r>
         <w:t>2.1 Агрегированные последствия химической аварии</w:t>
       </w:r>
@@ -4274,7 +4274,7 @@
       <w:pPr>
         <w:pStyle w:val="2"/>
       </w:pPr>
-      <w:bookmarkStart w:id="5" w:name="_Toc243312929"/>
+      <w:bookmarkStart w:id="5" w:name="_Toc243483666"/>
       <w:r>
         <w:t>2.2 Характеристики и внешние факторы</w:t>
       </w:r>
@@ -6371,7 +6371,7 @@
       <w:pPr>
         <w:pStyle w:val="2"/>
       </w:pPr>
-      <w:bookmarkStart w:id="6" w:name="_Toc243312930"/>
+      <w:bookmarkStart w:id="6" w:name="_Toc243483667"/>
       <w:r>
         <w:t>2.3 Отличие от расчёта опасной зоны</w:t>
       </w:r>
@@ -6391,7 +6391,7 @@
       <w:pPr>
         <w:pStyle w:val="1"/>
       </w:pPr>
-      <w:bookmarkStart w:id="7" w:name="_Toc243312931"/>
+      <w:bookmarkStart w:id="7" w:name="_Toc243483668"/>
       <w:r>
         <w:t>3 Математическая модель</w:t>
       </w:r>
@@ -6401,7 +6401,7 @@
       <w:pPr>
         <w:pStyle w:val="2"/>
       </w:pPr>
-      <w:bookmarkStart w:id="8" w:name="_Toc243312932"/>
+      <w:bookmarkStart w:id="8" w:name="_Toc243483669"/>
       <w:r>
         <w:t>3.1 Согласование записи исходного задания</w:t>
       </w:r>
@@ -6426,7 +6426,7 @@
       <w:pPr>
         <w:pStyle w:val="2"/>
       </w:pPr>
-      <w:bookmarkStart w:id="9" w:name="_Toc243312933"/>
+      <w:bookmarkStart w:id="9" w:name="_Toc243483670"/>
       <w:r>
         <w:t>3.2 Общая форма и начальные условия</w:t>
       </w:r>
@@ -6848,7 +6848,7 @@
       <w:pPr>
         <w:pStyle w:val="2"/>
       </w:pPr>
-      <w:bookmarkStart w:id="10" w:name="_Toc243312934"/>
+      <w:bookmarkStart w:id="10" w:name="_Toc243483671"/>
       <w:r>
         <w:t>3.3 Полная табличная система</w:t>
       </w:r>
@@ -10490,7 +10490,7 @@
       <w:pPr>
         <w:pStyle w:val="2"/>
       </w:pPr>
-      <w:bookmarkStart w:id="11" w:name="_Toc243312935"/>
+      <w:bookmarkStart w:id="11" w:name="_Toc243483672"/>
       <w:r>
         <w:t>3.4 Область определения и допустимость решений</w:t>
       </w:r>
@@ -10515,7 +10515,7 @@
       <w:pPr>
         <w:pStyle w:val="2"/>
       </w:pPr>
-      <w:bookmarkStart w:id="12" w:name="_Toc243312936"/>
+      <w:bookmarkStart w:id="12" w:name="_Toc243483673"/>
       <w:r>
         <w:t>3.5 План вычислительного эксперимента</w:t>
       </w:r>
@@ -10842,7 +10842,7 @@
       <w:pPr>
         <w:pStyle w:val="1"/>
       </w:pPr>
-      <w:bookmarkStart w:id="13" w:name="_Toc243312937"/>
+      <w:bookmarkStart w:id="13" w:name="_Toc243483674"/>
       <w:r>
         <w:t>4 Численный метод</w:t>
       </w:r>
@@ -10852,7 +10852,7 @@
       <w:pPr>
         <w:pStyle w:val="2"/>
       </w:pPr>
-      <w:bookmarkStart w:id="14" w:name="_Toc243312938"/>
+      <w:bookmarkStart w:id="14" w:name="_Toc243483675"/>
       <w:r>
         <w:t>4.1 Адаптивное решение задачи Коши</w:t>
       </w:r>
@@ -11078,7 +11078,7 @@
       <w:pPr>
         <w:pStyle w:val="2"/>
       </w:pPr>
-      <w:bookmarkStart w:id="15" w:name="_Toc243312939"/>
+      <w:bookmarkStart w:id="15" w:name="_Toc243483676"/>
       <w:r>
         <w:t>4.2 Сетка вывода и четыре четверти интервала</w:t>
       </w:r>
@@ -11098,7 +11098,7 @@
       <w:pPr>
         <w:pStyle w:val="2"/>
       </w:pPr>
-      <w:bookmarkStart w:id="16" w:name="_Toc243312940"/>
+      <w:bookmarkStart w:id="16" w:name="_Toc243483677"/>
       <w:r>
         <w:t>4.3 Нормирование лепестковых диаграмм</w:t>
       </w:r>
@@ -11502,7 +11502,7 @@
       <w:pPr>
         <w:pStyle w:val="2"/>
       </w:pPr>
-      <w:bookmarkStart w:id="17" w:name="_Toc243312941"/>
+      <w:bookmarkStart w:id="17" w:name="_Toc243483678"/>
       <w:r>
         <w:t>4.4 Критерии численного сопоставления</w:t>
       </w:r>
@@ -11941,7 +11941,7 @@
       <w:pPr>
         <w:pStyle w:val="1"/>
       </w:pPr>
-      <w:bookmarkStart w:id="18" w:name="_Toc243312942"/>
+      <w:bookmarkStart w:id="18" w:name="_Toc243483679"/>
       <w:r>
         <w:t>5 Программная реализация</w:t>
       </w:r>
@@ -11951,7 +11951,7 @@
       <w:pPr>
         <w:pStyle w:val="2"/>
       </w:pPr>
-      <w:bookmarkStart w:id="19" w:name="_Toc243312943"/>
+      <w:bookmarkStart w:id="19" w:name="_Toc243483680"/>
       <w:r>
         <w:t>5.1 Архитектура и структура проекта</w:t>
       </w:r>
@@ -11983,7 +11983,7 @@
           <w:noProof/>
         </w:rPr>
         <w:drawing>
-          <wp:inline distT="0" distB="0" distL="0" distR="0" wp14:anchorId="3BA45539" wp14:editId="2A664E3D">
+          <wp:inline distT="0" distB="0" distL="0" distR="0" wp14:anchorId="635B7D10" wp14:editId="47D9B53D">
             <wp:extent cx="5220000" cy="2182740"/>
             <wp:effectExtent l="0" t="0" r="0" b="0"/>
             <wp:docPr id="1" name="Picture 1" descr="Архитектура приложения и обмен данными между компонентами"/>
@@ -12715,7 +12715,7 @@
       <w:pPr>
         <w:pStyle w:val="2"/>
       </w:pPr>
-      <w:bookmarkStart w:id="20" w:name="_Toc243312944"/>
+      <w:bookmarkStart w:id="20" w:name="_Toc243483681"/>
       <w:r>
         <w:t>5.2 Безопасный редактор уравнений</w:t>
       </w:r>
@@ -12740,7 +12740,7 @@
       <w:pPr>
         <w:pStyle w:val="2"/>
       </w:pPr>
-      <w:bookmarkStart w:id="21" w:name="_Toc243312945"/>
+      <w:bookmarkStart w:id="21" w:name="_Toc243483682"/>
       <w:r>
         <w:t>5.3 Численное ядро и API</w:t>
       </w:r>
@@ -12838,7 +12838,7 @@
       <w:pPr>
         <w:pStyle w:val="2"/>
       </w:pPr>
-      <w:bookmarkStart w:id="22" w:name="_Toc243312946"/>
+      <w:bookmarkStart w:id="22" w:name="_Toc243483683"/>
       <w:r>
         <w:t>5.4 Проверяемость и экспорт</w:t>
       </w:r>
@@ -12858,7 +12858,7 @@
       <w:pPr>
         <w:pStyle w:val="2"/>
       </w:pPr>
-      <w:bookmarkStart w:id="23" w:name="_Toc243312947"/>
+      <w:bookmarkStart w:id="23" w:name="_Toc243483684"/>
       <w:r>
         <w:t>5.5 Сборка и запуск</w:t>
       </w:r>
@@ -12876,14 +12876,14 @@
     </w:p>
     <w:p>
       <w:r>
-        <w:t>GitHub хранит исходный код, результаты проверок и файлы отчёта [12]. Статический GitHub Pages не исполняет сервер Python. В репозитории предусмотрен CI-конвейер проверки тестов, сборки и повторного формирования экспериментов.</w:t>
+        <w:t>GitHub хранит исходный код, результаты проверок и файлы отчёта [12]. Онлайн-версия доступна по адресу https://snailrake.github.io/practwo/. В ней исходные Python-модули исполняются в браузере через Pyodide и WebAssembly [14], в отдельном Worker. Сервер FastAPI для такой версии не требуется. При первом открытии загружается среда с научными библиотеками; последующие расчёты выполняются на устройстве пользователя.</w:t>
       </w:r>
     </w:p>
     <w:p>
       <w:pPr>
         <w:pStyle w:val="1"/>
       </w:pPr>
-      <w:bookmarkStart w:id="24" w:name="_Toc243312948"/>
+      <w:bookmarkStart w:id="24" w:name="_Toc243483685"/>
       <w:r>
         <w:t>6 Пользовательский интерфейс</w:t>
       </w:r>
@@ -12893,7 +12893,7 @@
       <w:pPr>
         <w:pStyle w:val="2"/>
       </w:pPr>
-      <w:bookmarkStart w:id="25" w:name="_Toc243312949"/>
+      <w:bookmarkStart w:id="25" w:name="_Toc243483686"/>
       <w:r>
         <w:t>6.1 Настройка и просмотр динамики</w:t>
       </w:r>
@@ -12925,7 +12925,7 @@
           <w:noProof/>
         </w:rPr>
         <w:drawing>
-          <wp:inline distT="0" distB="0" distL="0" distR="0" wp14:anchorId="31D44E88" wp14:editId="38D57F1D">
+          <wp:inline distT="0" distB="0" distL="0" distR="0" wp14:anchorId="060ACA9E" wp14:editId="670BC0A0">
             <wp:extent cx="5832000" cy="4242857"/>
             <wp:effectExtent l="0" t="0" r="0" b="0"/>
             <wp:docPr id="2" name="Picture 2" descr="Основной экран с рассчитанным базовым сценарием"/>
@@ -12985,7 +12985,7 @@
       <w:pPr>
         <w:pStyle w:val="2"/>
       </w:pPr>
-      <w:bookmarkStart w:id="26" w:name="_Toc243312950"/>
+      <w:bookmarkStart w:id="26" w:name="_Toc243483687"/>
       <w:r>
         <w:t>6.2 Факторы и редактирование модели</w:t>
       </w:r>
@@ -13020,7 +13020,7 @@
           <w:noProof/>
         </w:rPr>
         <w:drawing>
-          <wp:inline distT="0" distB="0" distL="0" distR="0" wp14:anchorId="717A4EDA" wp14:editId="7C3000CB">
+          <wp:inline distT="0" distB="0" distL="0" distR="0" wp14:anchorId="48E9A0ED" wp14:editId="45CF8607">
             <wp:extent cx="5832000" cy="4242857"/>
             <wp:effectExtent l="0" t="0" r="0" b="0"/>
             <wp:docPr id="3" name="Picture 3" descr="Экран задания временных зависимостей внешних факторов"/>
@@ -13087,7 +13087,7 @@
           <w:noProof/>
         </w:rPr>
         <w:drawing>
-          <wp:inline distT="0" distB="0" distL="0" distR="0" wp14:anchorId="589B78D6" wp14:editId="5F7784C7">
+          <wp:inline distT="0" distB="0" distL="0" distR="0" wp14:anchorId="4555A3E4" wp14:editId="017D4A82">
             <wp:extent cx="5832000" cy="4242857"/>
             <wp:effectExtent l="0" t="0" r="0" b="0"/>
             <wp:docPr id="4" name="Picture 4" descr="Редактирование аналитических функций модели"/>
@@ -13142,7 +13142,7 @@
       <w:pPr>
         <w:pStyle w:val="2"/>
       </w:pPr>
-      <w:bookmarkStart w:id="27" w:name="_Toc243312951"/>
+      <w:bookmarkStart w:id="27" w:name="_Toc243483688"/>
       <w:r>
         <w:t>6.3 Лепестковые срезы и сравнение сценариев</w:t>
       </w:r>
@@ -13174,7 +13174,7 @@
           <w:noProof/>
         </w:rPr>
         <w:drawing>
-          <wp:inline distT="0" distB="0" distL="0" distR="0" wp14:anchorId="072DBABC" wp14:editId="00617C1E">
+          <wp:inline distT="0" distB="0" distL="0" distR="0" wp14:anchorId="3EA00730" wp14:editId="1C408B7E">
             <wp:extent cx="5832000" cy="4242857"/>
             <wp:effectExtent l="0" t="0" r="0" b="0"/>
             <wp:docPr id="5" name="Picture 5" descr="Интерактивные лепестковые срезы и масштабы осей"/>
@@ -13229,7 +13229,7 @@
       <w:pPr>
         <w:pStyle w:val="2"/>
       </w:pPr>
-      <w:bookmarkStart w:id="28" w:name="_Toc243312952"/>
+      <w:bookmarkStart w:id="28" w:name="_Toc243483689"/>
       <w:r>
         <w:t>6.4 Проверка и обработка ошибочного ввода</w:t>
       </w:r>
@@ -13261,7 +13261,7 @@
           <w:noProof/>
         </w:rPr>
         <w:drawing>
-          <wp:inline distT="0" distB="0" distL="0" distR="0" wp14:anchorId="36E338C1" wp14:editId="4605243F">
+          <wp:inline distT="0" distB="0" distL="0" distR="0" wp14:anchorId="7334118D" wp14:editId="2F923194">
             <wp:extent cx="5832000" cy="4242857"/>
             <wp:effectExtent l="0" t="0" r="0" b="0"/>
             <wp:docPr id="6" name="Picture 6" descr="Работающая встроенная проверка численного решения"/>
@@ -13316,7 +13316,7 @@
       <w:pPr>
         <w:pStyle w:val="1"/>
       </w:pPr>
-      <w:bookmarkStart w:id="29" w:name="_Toc243312953"/>
+      <w:bookmarkStart w:id="29" w:name="_Toc243483690"/>
       <w:r>
         <w:t>7 Верификация и вычислительные эксперименты</w:t>
       </w:r>
@@ -13326,7 +13326,7 @@
       <w:pPr>
         <w:pStyle w:val="2"/>
       </w:pPr>
-      <w:bookmarkStart w:id="30" w:name="_Toc243312954"/>
+      <w:bookmarkStart w:id="30" w:name="_Toc243483691"/>
       <w:r>
         <w:t>7.1 Аналитические и независимые численные проверки</w:t>
       </w:r>
@@ -14326,7 +14326,7 @@
           <w:noProof/>
         </w:rPr>
         <w:drawing>
-          <wp:inline distT="0" distB="0" distL="0" distR="0" wp14:anchorId="4E4C6ED6" wp14:editId="6544DB6F">
+          <wp:inline distT="0" distB="0" distL="0" distR="0" wp14:anchorId="1684CF36" wp14:editId="000E194C">
             <wp:extent cx="5832000" cy="2285403"/>
             <wp:effectExtent l="0" t="0" r="0" b="0"/>
             <wp:docPr id="7" name="Picture 7" descr="Ошибки аналитических и межметодных проверок"/>
@@ -14386,7 +14386,7 @@
       <w:pPr>
         <w:pStyle w:val="2"/>
       </w:pPr>
-      <w:bookmarkStart w:id="31" w:name="_Toc243312955"/>
+      <w:bookmarkStart w:id="31" w:name="_Toc243483692"/>
       <w:r>
         <w:t>7.2 Автоматические тесты и граничные случаи</w:t>
       </w:r>
@@ -14394,7 +14394,7 @@
     </w:p>
     <w:p>
       <w:r>
-        <w:t>Автоматический набор pytest содержит 52 успешно выполненных тестовых случаев. В него входят независимая арифметическая сверка всех табличных функций в исходной точке, четыре готовых сценария, точность срезов, неизменность несвязанных факторных профилей, редактирование обеих частей производной и проверки API. Отдельно проверяется отсутствие скрытого обрезания отрицательных решений.</w:t>
+        <w:t>Автоматический набор pytest содержит 58 успешно выполненных тестовых случаев. В него входят независимая арифметическая сверка всех табличных функций в исходной точке, четыре готовых сценария, точность срезов, неизменность несвязанных факторных профилей, редактирование обеих частей производной и проверки API. Отдельно проверяется отсутствие скрытого обрезания отрицательных решений.</w:t>
       </w:r>
     </w:p>
     <w:p>
@@ -14405,6 +14405,11 @@
     <w:p>
       <w:r>
         <w:t>В браузере пройдены 34 автоматизированных проверок: загрузка результатов Python, 11 временных графиков, воспроизведение и шаг, изменение формул, сравнение, живой протокол верификации, импорт JSON, экспорт CSV/JSON/PNG и мобильная ширина 390 px. Необработанных ошибок JavaScript в этом прогоне не обнаружено. Типизация TypeScript и production-сборка также завершены успешно.</w:t>
+      </w:r>
+    </w:p>
+    <w:p>
+      <w:r>
+        <w:t>Статическая версия отдельно прошла 30 проверок. В её среде использованы Python 3.14.2, NumPy 2.4.6 и SciPy 1.18.0. Максимальное масштабированное расхождение полных траекторий четырёх сценариев с локальным ядром составило 1.855e-16 при критерии 10⁻⁹. Также выполнены все пять встроенных численных проверок и аналитический пример с введённым пользователем уравнением.</w:t>
       </w:r>
     </w:p>
     <w:p>
@@ -14976,7 +14981,7 @@
       <w:pPr>
         <w:pStyle w:val="2"/>
       </w:pPr>
-      <w:bookmarkStart w:id="32" w:name="_Toc243312956"/>
+      <w:bookmarkStart w:id="32" w:name="_Toc243483693"/>
       <w:r>
         <w:t>7.3 Базовый сценарий</w:t>
       </w:r>
@@ -15008,8 +15013,8 @@
           <w:noProof/>
         </w:rPr>
         <w:drawing>
-          <wp:inline distT="0" distB="0" distL="0" distR="0" wp14:anchorId="1DA32D68" wp14:editId="1811C0D5">
-            <wp:extent cx="5832000" cy="6462893"/>
+          <wp:inline distT="0" distB="0" distL="0" distR="0" wp14:anchorId="37ED2172" wp14:editId="1F28EC08">
+            <wp:extent cx="5184000" cy="5744793"/>
             <wp:effectExtent l="0" t="0" r="0" b="0"/>
             <wp:docPr id="8" name="Picture 8" descr="Временные зависимости характеристик X₁–X₆ базового сценария"/>
             <wp:cNvGraphicFramePr>
@@ -15031,7 +15036,7 @@
                   <pic:spPr>
                     <a:xfrm>
                       <a:off x="0" y="0"/>
-                      <a:ext cx="5832000" cy="6462893"/>
+                      <a:ext cx="5184000" cy="5744793"/>
                     </a:xfrm>
                     <a:prstGeom prst="rect">
                       <a:avLst/>
@@ -15075,7 +15080,7 @@
           <w:noProof/>
         </w:rPr>
         <w:drawing>
-          <wp:inline distT="0" distB="0" distL="0" distR="0" wp14:anchorId="7C1F5AE1" wp14:editId="59EE7015">
+          <wp:inline distT="0" distB="0" distL="0" distR="0" wp14:anchorId="7FF3B94E" wp14:editId="4418F3B3">
             <wp:extent cx="5832000" cy="6462893"/>
             <wp:effectExtent l="0" t="0" r="0" b="0"/>
             <wp:docPr id="9" name="Picture 9" descr="Временные зависимости характеристик X₇–X₁₁ базового сценария"/>
@@ -16782,7 +16787,7 @@
       <w:pPr>
         <w:pStyle w:val="2"/>
       </w:pPr>
-      <w:bookmarkStart w:id="33" w:name="_Toc243312957"/>
+      <w:bookmarkStart w:id="33" w:name="_Toc243483694"/>
       <w:r>
         <w:t>7.4 Лепестковые диаграммы четырёх четвертей</w:t>
       </w:r>
@@ -16809,7 +16814,7 @@
           <w:noProof/>
         </w:rPr>
         <w:drawing>
-          <wp:inline distT="0" distB="0" distL="0" distR="0" wp14:anchorId="2B4EC9B2" wp14:editId="089C7301">
+          <wp:inline distT="0" distB="0" distL="0" distR="0" wp14:anchorId="0C49F85E" wp14:editId="0CC9D590">
             <wp:extent cx="5832000" cy="6061075"/>
             <wp:effectExtent l="0" t="0" r="0" b="0"/>
             <wp:docPr id="10" name="Picture 10" descr="Состояния модели в конце каждой четверти единичного интервала"/>
@@ -16869,7 +16874,7 @@
       <w:pPr>
         <w:pStyle w:val="2"/>
       </w:pPr>
-      <w:bookmarkStart w:id="34" w:name="_Toc243312958"/>
+      <w:bookmarkStart w:id="34" w:name="_Toc243483695"/>
       <w:r>
         <w:t>7.5 Изменение внешних факторов</w:t>
       </w:r>
@@ -16896,7 +16901,7 @@
           <w:noProof/>
         </w:rPr>
         <w:drawing>
-          <wp:inline distT="0" distB="0" distL="0" distR="0" wp14:anchorId="74F4AFD2" wp14:editId="6A0A0FE9">
+          <wp:inline distT="0" distB="0" distL="0" distR="0" wp14:anchorId="3612BD9F" wp14:editId="08013B1B">
             <wp:extent cx="5832000" cy="6699477"/>
             <wp:effectExtent l="0" t="0" r="0" b="0"/>
             <wp:docPr id="11" name="Picture 11" descr="Заданные профили семи факторов и исследуемые возмущения"/>
@@ -16963,7 +16968,7 @@
           <w:noProof/>
         </w:rPr>
         <w:drawing>
-          <wp:inline distT="0" distB="0" distL="0" distR="0" wp14:anchorId="1F114AF8" wp14:editId="7575C017">
+          <wp:inline distT="0" distB="0" distL="0" distR="0" wp14:anchorId="32453315" wp14:editId="23C56FEB">
             <wp:extent cx="5832000" cy="4468822"/>
             <wp:effectExtent l="0" t="0" r="0" b="0"/>
             <wp:docPr id="12" name="Picture 12" descr="Сопоставление базового сценария с изменением ветра и задержки"/>
@@ -18670,7 +18675,7 @@
       <w:pPr>
         <w:pStyle w:val="2"/>
       </w:pPr>
-      <w:bookmarkStart w:id="35" w:name="_Toc243312959"/>
+      <w:bookmarkStart w:id="35" w:name="_Toc243483696"/>
       <w:r>
         <w:t>7.6 Влияние объёма выброса</w:t>
       </w:r>
@@ -18697,7 +18702,7 @@
           <w:noProof/>
         </w:rPr>
         <w:drawing>
-          <wp:inline distT="0" distB="0" distL="0" distR="0" wp14:anchorId="415734CE" wp14:editId="4991A5D1">
+          <wp:inline distT="0" distB="0" distL="0" distR="0" wp14:anchorId="68634231" wp14:editId="42EF3801">
             <wp:extent cx="5832000" cy="2419980"/>
             <wp:effectExtent l="0" t="0" r="0" b="0"/>
             <wp:docPr id="13" name="Picture 13" descr="Влияние увеличенного объёма выброса на характеристики X₂, X₆ и X₁₁"/>
@@ -18762,7 +18767,7 @@
       <w:pPr>
         <w:pStyle w:val="1"/>
       </w:pPr>
-      <w:bookmarkStart w:id="36" w:name="_Toc243312960"/>
+      <w:bookmarkStart w:id="36" w:name="_Toc243483697"/>
       <w:r>
         <w:t>8 Ограничения модели</w:t>
       </w:r>
@@ -18772,7 +18777,7 @@
       <w:pPr>
         <w:pStyle w:val="2"/>
       </w:pPr>
-      <w:bookmarkStart w:id="37" w:name="_Toc243312961"/>
+      <w:bookmarkStart w:id="37" w:name="_Toc243483698"/>
       <w:r>
         <w:t>8.1 Непроверенная физическая калибровка</w:t>
       </w:r>
@@ -18797,7 +18802,7 @@
       <w:pPr>
         <w:pStyle w:val="2"/>
       </w:pPr>
-      <w:bookmarkStart w:id="38" w:name="_Toc243312962"/>
+      <w:bookmarkStart w:id="38" w:name="_Toc243483699"/>
       <w:r>
         <w:t>8.2 Структурные и вычислительные ограничения</w:t>
       </w:r>
@@ -18815,14 +18820,14 @@
     </w:p>
     <w:p>
       <w:r>
-        <w:t>Нормировка радара использует максимум по сетке вывода, а не строгую задачу глобальной оптимизации по непрерывному времени. Встроенная проверка использует конечный набор эталонов и один сравниваемый сценарий. Она не является доказательством корректности для всех возможных пользовательских формул. Приложение запускается локально; публикация исходников на GitHub не равнозначна размещению работающего Python-сервера в интернете.</w:t>
+        <w:t>Нормировка радара использует максимум по сетке вывода, а не строгую задачу глобальной оптимизации по непрерывному времени. Встроенная проверка использует конечный набор эталонов и один сравниваемый сценарий. Она не является доказательством корректности для всех возможных пользовательских формул. Веб-версия зависит от поддержки WebAssembly браузером, доступной памяти и скорости устройства. Локальная версия с сервером Python сохранена как отдельный способ запуска.</w:t>
       </w:r>
     </w:p>
     <w:p>
       <w:pPr>
         <w:pStyle w:val="1"/>
       </w:pPr>
-      <w:bookmarkStart w:id="39" w:name="_Toc243312963"/>
+      <w:bookmarkStart w:id="39" w:name="_Toc243483700"/>
       <w:r>
         <w:t>9 Заключение</w:t>
       </w:r>
@@ -18840,7 +18845,7 @@
     </w:p>
     <w:p>
       <w:r>
-        <w:t>Корректность реализации подтверждена 52 автоматическими тестовыми случаями, 34 браузерными проверками, аналитическими решениями и сопоставлением трёх численных методов. Все заявленные численные критерии выполнены. Во всех четырёх экспериментах сохранена одна табличная система; менялись только явно указанные внешние условия.</w:t>
+        <w:t>Корректность реализации подтверждена 58 автоматическими тестовыми случаями, 34 браузерными проверками, аналитическими решениями и сопоставлением трёх численных методов. Все заявленные численные критерии выполнены. Во всех четырёх экспериментах сохранена одна табличная система; менялись только явно указанные внешние условия.</w:t>
       </w:r>
     </w:p>
     <w:p>
@@ -18852,7 +18857,7 @@
       <w:pPr>
         <w:pStyle w:val="1"/>
       </w:pPr>
-      <w:bookmarkStart w:id="40" w:name="_Toc243312964"/>
+      <w:bookmarkStart w:id="40" w:name="_Toc243483701"/>
       <w:r>
         <w:t>Список использованных источников</w:t>
       </w:r>
@@ -19119,9 +19124,30 @@
         </w:r>
       </w:hyperlink>
     </w:p>
+    <w:p>
+      <w:pPr>
+        <w:spacing w:after="140" w:line="252" w:lineRule="auto"/>
+        <w:ind w:left="397" w:hanging="397"/>
+      </w:pPr>
+      <w:r>
+        <w:t>14. Pyodide. Using Pyodide in a web worker. Официальная документация среды запуска Python в WebAssembly. Электронный ресурс.</w:t>
+      </w:r>
+      <w:r>
+        <w:t xml:space="preserve"> </w:t>
+      </w:r>
+      <w:hyperlink r:id="rId32">
+        <w:r>
+          <w:rPr>
+            <w:sz w:val="24"/>
+            <w:u w:val="single"/>
+          </w:rPr>
+          <w:t>Электронный текст</w:t>
+        </w:r>
+      </w:hyperlink>
+    </w:p>
     <w:sectPr>
-      <w:footerReference w:type="default" r:id="rId32"/>
-      <w:footerReference w:type="first" r:id="rId33"/>
+      <w:footerReference w:type="default" r:id="rId33"/>
+      <w:footerReference w:type="first" r:id="rId34"/>
       <w:pgSz w:w="11906" w:h="16838"/>
       <w:pgMar w:top="1134" w:right="850" w:bottom="1134" w:left="1701" w:header="708" w:footer="500" w:gutter="0"/>
       <w:cols w:space="720"/>
@@ -19400,19 +19426,19 @@
       <w:lvlJc w:val="left"/>
     </w:lvl>
   </w:abstractNum>
-  <w:num w:numId="1" w16cid:durableId="1686396453">
+  <w:num w:numId="1" w16cid:durableId="125126650">
     <w:abstractNumId w:val="0"/>
     <w:lvlOverride w:ilvl="0">
       <w:startOverride w:val="1"/>
     </w:lvlOverride>
   </w:num>
-  <w:num w:numId="2" w16cid:durableId="1222056218">
+  <w:num w:numId="2" w16cid:durableId="1624650707">
     <w:abstractNumId w:val="2"/>
     <w:lvlOverride w:ilvl="0">
       <w:startOverride w:val="1"/>
     </w:lvlOverride>
   </w:num>
-  <w:num w:numId="3" w16cid:durableId="357729">
+  <w:num w:numId="3" w16cid:durableId="470289104">
     <w:abstractNumId w:val="1"/>
     <w:lvlOverride w:ilvl="0">
       <w:startOverride w:val="1"/>
@@ -20085,7 +20111,7 @@
     <w:autoRedefine/>
     <w:uiPriority w:val="39"/>
     <w:unhideWhenUsed/>
-    <w:rsid w:val="00B1252B"/>
+    <w:rsid w:val="00426F11"/>
   </w:style>
   <w:style w:type="paragraph" w:styleId="20">
     <w:name w:val="toc 2"/>
@@ -20094,7 +20120,7 @@
     <w:autoRedefine/>
     <w:uiPriority w:val="39"/>
     <w:unhideWhenUsed/>
-    <w:rsid w:val="00B1252B"/>
+    <w:rsid w:val="00426F11"/>
     <w:pPr>
       <w:ind w:left="280"/>
     </w:pPr>

</xml_diff>